<commit_message>
journal v4_ko: search strategy figure → Table 1 (merged with CPC table); figures renumbered 1–4
Co-Authored-By: Claude Fable 5.1 <noreply@anthropic.com>
Claude-Session: https://claude.ai/code/session_01SvckvZxt3hAXTDPnm8YPEC
</commit_message>
<xml_diff>
--- a/journal/manuscript_v4_ko.docx
+++ b/journal/manuscript_v4_ko.docx
@@ -28,7 +28,7 @@
         </w:p>
       </w:sdtContent>
     </w:sdt>
-    <w:bookmarkStart w:id="48" w:name="X68cd19da2f6b8030fec82317a34f434a38a76ce"/>
+    <w:bookmarkStart w:id="45" w:name="X68cd19da2f6b8030fec82317a34f434a38a76ce"/>
     <w:p>
       <w:pPr>
         <w:pStyle w:val="Heading1"/>
@@ -1064,7 +1064,7 @@
       </w:r>
     </w:p>
     <w:bookmarkEnd w:id="17"/>
-    <w:bookmarkStart w:id="27" w:name="데이터와-방법"/>
+    <w:bookmarkStart w:id="24" w:name="데이터와-방법"/>
     <w:p>
       <w:pPr>
         <w:pStyle w:val="Heading2"/>
@@ -1073,7 +1073,7 @@
         <w:t xml:space="preserve">4. 데이터와 방법</w:t>
       </w:r>
     </w:p>
-    <w:bookmarkStart w:id="21" w:name="데이터"/>
+    <w:bookmarkStart w:id="18" w:name="데이터"/>
     <w:p>
       <w:pPr>
         <w:pStyle w:val="Heading3"/>
@@ -1149,7 +1149,7 @@
         <w:t xml:space="preserve">metal-oxide bond</w:t>
       </w:r>
       <w:r>
-        <w:t xml:space="preserve">)의 AND 결합으로 필터링하였다(표 1, 그림 1). 추출 결과는 출원–CPC 레코드 5,277건이며 각 레코드는 하나의 출원과 하나의 CPC 기호의 쌍이다. 출원 수준으로 응집하면 1968–2024년에 출원된 고유 출원 928건이 된다. 모든 기호는 H01L(반도체 장치) 아래에 있으며, 그 안에서 레코드는 본 연구에서 전/후공정 경계를 정의하는 두 클래스 H01L21과 H01L24로 나뉜다.</w:t>
+        <w:t xml:space="preserve">)의 AND 결합으로 필터링하였다(표 1). 추출 결과는 출원–CPC 레코드 5,277건이며 각 레코드는 하나의 출원과 하나의 CPC 기호의 쌍이다. 출원 수준으로 응집하면 1968–2024년에 출원된 고유 출원 928건이 된다. 모든 기호는 H01L(반도체 장치) 아래에 있으며, 그 안에서 레코드는 본 연구에서 전/후공정 경계를 정의하는 두 클래스 H01L21과 H01L24로 나뉜다.</w:t>
       </w:r>
     </w:p>
     <w:p>
@@ -1167,7 +1167,472 @@
         <w:t xml:space="preserve"> </w:t>
       </w:r>
       <w:r>
-        <w:t xml:space="preserve">전/후공정 경계를 정의하는 CPC 클래스.</w:t>
+        <w:t xml:space="preserve">하이브리드 본딩 특허의 검색 전략(CPC 1차 분류와 키워드 2차 분류).</w:t>
+      </w:r>
+    </w:p>
+    <w:tbl>
+      <w:tblPr>
+        <w:tblStyle w:val="Table"/>
+        <w:tblW w:type="pct" w:w="5000"/>
+        <w:tblLayout w:type="fixed"/>
+        <w:tblLook w:firstRow="1" w:lastRow="0" w:firstColumn="0" w:lastColumn="0" w:noHBand="0" w:noVBand="0" w:val="0020"/>
+      </w:tblPr>
+      <w:tblGrid>
+        <w:gridCol w:w="1980"/>
+        <w:gridCol w:w="1980"/>
+        <w:gridCol w:w="1980"/>
+        <w:gridCol w:w="1980"/>
+      </w:tblGrid>
+      <w:tr>
+        <w:trPr>
+          <w:tblHeader w:val="on"/>
+        </w:trPr>
+        <w:tc>
+          <w:tcPr/>
+          <w:p>
+            <w:pPr>
+              <w:pStyle w:val="Compact"/>
+            </w:pPr>
+            <w:r>
+              <w:t xml:space="preserve">검색 순서</w:t>
+            </w:r>
+          </w:p>
+        </w:tc>
+        <w:tc>
+          <w:tcPr/>
+          <w:p>
+            <w:pPr>
+              <w:pStyle w:val="Compact"/>
+            </w:pPr>
+            <w:r>
+              <w:t xml:space="preserve">CPC 코드</w:t>
+            </w:r>
+          </w:p>
+        </w:tc>
+        <w:tc>
+          <w:tcPr/>
+          <w:p>
+            <w:pPr>
+              <w:pStyle w:val="Compact"/>
+            </w:pPr>
+            <w:r>
+              <w:t xml:space="preserve">설명</w:t>
+            </w:r>
+          </w:p>
+        </w:tc>
+        <w:tc>
+          <w:tcPr/>
+          <w:p>
+            <w:pPr>
+              <w:pStyle w:val="Compact"/>
+            </w:pPr>
+            <w:r>
+              <w:t xml:space="preserve">주요 기술</w:t>
+            </w:r>
+          </w:p>
+        </w:tc>
+      </w:tr>
+      <w:tr>
+        <w:tc>
+          <w:tcPr/>
+          <w:p>
+            <w:pPr>
+              <w:pStyle w:val="Compact"/>
+            </w:pPr>
+            <w:r>
+              <w:t xml:space="preserve">1차 분류</w:t>
+            </w:r>
+          </w:p>
+        </w:tc>
+        <w:tc>
+          <w:tcPr/>
+          <w:p>
+            <w:pPr>
+              <w:pStyle w:val="Compact"/>
+            </w:pPr>
+            <w:r>
+              <w:t xml:space="preserve">H01L21</w:t>
+            </w:r>
+          </w:p>
+        </w:tc>
+        <w:tc>
+          <w:tcPr/>
+          <w:p>
+            <w:pPr>
+              <w:pStyle w:val="Compact"/>
+            </w:pPr>
+            <w:r>
+              <w:t xml:space="preserve">반도체 장치 또는 부품의 제조 또는 처리에 특별히 적합한 공정 및 장치</w:t>
+            </w:r>
+          </w:p>
+        </w:tc>
+        <w:tc>
+          <w:tcPr/>
+          <w:p>
+            <w:pPr>
+              <w:pStyle w:val="Compact"/>
+            </w:pPr>
+            <w:r>
+              <w:rPr>
+                <w:b/>
+                <w:bCs/>
+              </w:rPr>
+              <w:t xml:space="preserve">전공정 및 후공정 제조 기술 전반</w:t>
+            </w:r>
+            <w:r>
+              <w:t xml:space="preserve"> </w:t>
+            </w:r>
+            <w:r>
+              <w:t xml:space="preserve">— 리소그래피, 식각, 증착, 이온주입, 화학적 기계연마, 웨이퍼 세정 및 가공</w:t>
+            </w:r>
+          </w:p>
+        </w:tc>
+      </w:tr>
+      <w:tr>
+        <w:tc>
+          <w:tcPr/>
+          <w:p>
+            <w:pPr>
+              <w:pStyle w:val="Compact"/>
+            </w:pPr>
+            <w:r>
+              <w:t xml:space="preserve">1차 분류</w:t>
+            </w:r>
+          </w:p>
+        </w:tc>
+        <w:tc>
+          <w:tcPr/>
+          <w:p>
+            <w:pPr>
+              <w:pStyle w:val="Compact"/>
+            </w:pPr>
+            <w:r>
+              <w:t xml:space="preserve">H01L24</w:t>
+            </w:r>
+          </w:p>
+        </w:tc>
+        <w:tc>
+          <w:tcPr/>
+          <w:p>
+            <w:pPr>
+              <w:pStyle w:val="Compact"/>
+            </w:pPr>
+            <w:r>
+              <w:t xml:space="preserve">반도체 바디(body)의 전기적 연결 또는 분리를 위한 장치 및 방법</w:t>
+            </w:r>
+          </w:p>
+        </w:tc>
+        <w:tc>
+          <w:tcPr/>
+          <w:p>
+            <w:pPr>
+              <w:pStyle w:val="Compact"/>
+            </w:pPr>
+            <w:r>
+              <w:rPr>
+                <w:b/>
+                <w:bCs/>
+              </w:rPr>
+              <w:t xml:space="preserve">패키징 인터커넥션 핵심 기술</w:t>
+            </w:r>
+            <w:r>
+              <w:t xml:space="preserve"> </w:t>
+            </w:r>
+            <w:r>
+              <w:t xml:space="preserve">— 와이어 본딩, 플립칩 본딩, TSV, 하이브리드 본딩, 솔더 범프/볼 형성, 재배선 공정</w:t>
+            </w:r>
+          </w:p>
+        </w:tc>
+      </w:tr>
+      <w:tr>
+        <w:tc>
+          <w:tcPr/>
+          <w:p>
+            <w:pPr>
+              <w:pStyle w:val="Compact"/>
+            </w:pPr>
+            <w:r>
+              <w:t xml:space="preserve">2차 분류</w:t>
+            </w:r>
+          </w:p>
+        </w:tc>
+        <w:tc>
+          <w:tcPr/>
+          <w:p>
+            <w:pPr>
+              <w:pStyle w:val="Compact"/>
+            </w:pPr>
+            <w:r>
+              <w:t xml:space="preserve">키워드</w:t>
+            </w:r>
+          </w:p>
+        </w:tc>
+        <w:tc>
+          <w:tcPr/>
+          <w:p>
+            <w:pPr>
+              <w:pStyle w:val="Compact"/>
+            </w:pPr>
+            <w:r>
+              <w:rPr>
+                <w:i/>
+                <w:iCs/>
+              </w:rPr>
+              <w:t xml:space="preserve">hybrid bonding</w:t>
+            </w:r>
+            <w:r>
+              <w:t xml:space="preserve">,</w:t>
+            </w:r>
+            <w:r>
+              <w:t xml:space="preserve"> </w:t>
+            </w:r>
+            <w:r>
+              <w:rPr>
+                <w:i/>
+                <w:iCs/>
+              </w:rPr>
+              <w:t xml:space="preserve">direct bonding</w:t>
+            </w:r>
+            <w:r>
+              <w:t xml:space="preserve">,</w:t>
+            </w:r>
+            <w:r>
+              <w:t xml:space="preserve"> </w:t>
+            </w:r>
+            <w:r>
+              <w:rPr>
+                <w:i/>
+                <w:iCs/>
+              </w:rPr>
+              <w:t xml:space="preserve">Cu–Cu</w:t>
+            </w:r>
+            <w:r>
+              <w:t xml:space="preserve">,</w:t>
+            </w:r>
+            <w:r>
+              <w:t xml:space="preserve"> </w:t>
+            </w:r>
+            <w:r>
+              <w:rPr>
+                <w:i/>
+                <w:iCs/>
+              </w:rPr>
+              <w:t xml:space="preserve">copper to copper</w:t>
+            </w:r>
+            <w:r>
+              <w:t xml:space="preserve">,</w:t>
+            </w:r>
+            <w:r>
+              <w:t xml:space="preserve"> </w:t>
+            </w:r>
+            <w:r>
+              <w:rPr>
+                <w:i/>
+                <w:iCs/>
+              </w:rPr>
+              <w:t xml:space="preserve">metal-oxide bond</w:t>
+            </w:r>
+            <w:r>
+              <w:t xml:space="preserve"> </w:t>
+            </w:r>
+            <w:r>
+              <w:t xml:space="preserve">(AND 결합)</w:t>
+            </w:r>
+          </w:p>
+        </w:tc>
+        <w:tc>
+          <w:tcPr/>
+          <w:p>
+            <w:pPr>
+              <w:pStyle w:val="Compact"/>
+            </w:pPr>
+            <w:r>
+              <w:t xml:space="preserve">위양성 제거</w:t>
+            </w:r>
+          </w:p>
+        </w:tc>
+      </w:tr>
+    </w:tbl>
+    <w:p>
+      <w:pPr>
+        <w:pStyle w:val="BodyText"/>
+      </w:pPr>
+      <w:r>
+        <w:rPr>
+          <w:i/>
+          <w:iCs/>
+        </w:rPr>
+        <w:t xml:space="preserve">주:</w:t>
+      </w:r>
+      <w:r>
+        <w:t xml:space="preserve"> </w:t>
+      </w:r>
+      <w:r>
+        <w:t xml:space="preserve">H01L2224는 H01L24의 연결 기술에 대한 인덱싱 코드로, 접합 금속·형태·장비를 세부 태깅한다(예: H01L2224/08145, 금속–금속 및 유전체–유전체 접합을 결합한 직접 접합). 1차 분류에는 두 클래스의 인덱싱 코드를 포함하였다.</w:t>
+      </w:r>
+    </w:p>
+    <w:bookmarkEnd w:id="18"/>
+    <w:bookmarkStart w:id="22" w:name="변수"/>
+    <w:p>
+      <w:pPr>
+        <w:pStyle w:val="Heading3"/>
+      </w:pPr>
+      <w:r>
+        <w:t xml:space="preserve">4.2 변수</w:t>
+      </w:r>
+    </w:p>
+    <w:p>
+      <w:pPr>
+        <w:pStyle w:val="FirstParagraph"/>
+      </w:pPr>
+      <w:r>
+        <w:t xml:space="preserve">표 2는 변수를 정의한다.</w:t>
+      </w:r>
+      <w:r>
+        <w:t xml:space="preserve"> </w:t>
+      </w:r>
+      <w:r>
+        <w:rPr>
+          <w:i/>
+          <w:iCs/>
+        </w:rPr>
+        <w:t xml:space="preserve">기술범위(breadth)</w:t>
+      </w:r>
+      <w:r>
+        <w:t xml:space="preserve"> </w:t>
+      </w:r>
+      <w:r>
+        <w:t xml:space="preserve">는 출원에 부여된 고유 CPC 서브클래스 기호의 수로, Lerner(1994)의 전통에 따른 기술범위의 측정치다.</w:t>
+      </w:r>
+      <w:r>
+        <w:t xml:space="preserve"> </w:t>
+      </w:r>
+      <w:r>
+        <w:rPr>
+          <w:i/>
+          <w:iCs/>
+        </w:rPr>
+        <w:t xml:space="preserve">Has_process</w:t>
+      </w:r>
+      <w:r>
+        <w:t xml:space="preserve"> </w:t>
+      </w:r>
+      <w:r>
+        <w:t xml:space="preserve">는 출원이 H01L21 기호를 하나라도 보유하면 1인 이항 지표로, 경계 넘기의 측정치다.</w:t>
+      </w:r>
+      <w:r>
+        <w:t xml:space="preserve"> </w:t>
+      </w:r>
+      <w:r>
+        <w:rPr>
+          <w:i/>
+          <w:iCs/>
+        </w:rPr>
+        <w:t xml:space="preserve">Tech_cat</w:t>
+      </w:r>
+      <w:r>
+        <w:t xml:space="preserve"> </w:t>
+      </w:r>
+      <w:r>
+        <w:t xml:space="preserve">은 각 출원을 상호배타적인 세 전략 유형, 즉</w:t>
+      </w:r>
+      <w:r>
+        <w:t xml:space="preserve"> </w:t>
+      </w:r>
+      <w:r>
+        <w:rPr>
+          <w:i/>
+          <w:iCs/>
+        </w:rPr>
+        <w:t xml:space="preserve">조립 단독형(assembly-only)</w:t>
+      </w:r>
+      <w:r>
+        <w:t xml:space="preserve"> </w:t>
+      </w:r>
+      <w:r>
+        <w:t xml:space="preserve">(H01L24 기호만),</w:t>
+      </w:r>
+      <w:r>
+        <w:t xml:space="preserve"> </w:t>
+      </w:r>
+      <w:r>
+        <w:rPr>
+          <w:i/>
+          <w:iCs/>
+        </w:rPr>
+        <w:t xml:space="preserve">통합형(integrated)</w:t>
+      </w:r>
+      <w:r>
+        <w:t xml:space="preserve"> </w:t>
+      </w:r>
+      <w:r>
+        <w:t xml:space="preserve">(H01L24와 H01L21 모두),</w:t>
+      </w:r>
+      <w:r>
+        <w:t xml:space="preserve"> </w:t>
+      </w:r>
+      <w:r>
+        <w:rPr>
+          <w:i/>
+          <w:iCs/>
+        </w:rPr>
+        <w:t xml:space="preserve">공정 단독형(process-only)</w:t>
+      </w:r>
+      <w:r>
+        <w:t xml:space="preserve"> </w:t>
+      </w:r>
+      <w:r>
+        <w:t xml:space="preserve">(H01L21 기호만)에 배정한다.</w:t>
+      </w:r>
+      <w:r>
+        <w:t xml:space="preserve"> </w:t>
+      </w:r>
+      <w:r>
+        <w:rPr>
+          <w:i/>
+          <w:iCs/>
+        </w:rPr>
+        <w:t xml:space="preserve">Ccode</w:t>
+      </w:r>
+      <w:r>
+        <w:t xml:space="preserve"> </w:t>
+      </w:r>
+      <w:r>
+        <w:t xml:space="preserve">는 출원이 제출된 출원청으로, 8개 수준(US, CN, KR, TW, JP, EP, WO, 기타)이며 미국 출원청이 기준이다.</w:t>
+      </w:r>
+      <w:r>
+        <w:t xml:space="preserve"> </w:t>
+      </w:r>
+      <w:r>
+        <w:rPr>
+          <w:i/>
+          <w:iCs/>
+        </w:rPr>
+        <w:t xml:space="preserve">Yc</w:t>
+      </w:r>
+      <w:r>
+        <w:t xml:space="preserve"> </w:t>
+      </w:r>
+      <w:r>
+        <w:t xml:space="preserve">는 표본 최초 출원 이후 경과 연수로 측정한 출원연도다.</w:t>
+      </w:r>
+    </w:p>
+    <w:p>
+      <w:pPr>
+        <w:pStyle w:val="BodyText"/>
+      </w:pPr>
+      <w:r>
+        <w:rPr>
+          <w:b/>
+          <w:bCs/>
+        </w:rPr>
+        <w:t xml:space="preserve">표 2.</w:t>
+      </w:r>
+      <w:r>
+        <w:t xml:space="preserve"> </w:t>
+      </w:r>
+      <w:r>
+        <w:t xml:space="preserve">변수 정의.</w:t>
       </w:r>
     </w:p>
     <w:tbl>
@@ -1193,29 +1658,29 @@
               <w:pStyle w:val="Compact"/>
             </w:pPr>
             <w:r>
-              <w:t xml:space="preserve">CPC</w:t>
-            </w:r>
-          </w:p>
-        </w:tc>
-        <w:tc>
-          <w:tcPr/>
-          <w:p>
-            <w:pPr>
-              <w:pStyle w:val="Compact"/>
-            </w:pPr>
-            <w:r>
-              <w:t xml:space="preserve">명칭(요약)</w:t>
-            </w:r>
-          </w:p>
-        </w:tc>
-        <w:tc>
-          <w:tcPr/>
-          <w:p>
-            <w:pPr>
-              <w:pStyle w:val="Compact"/>
-            </w:pPr>
-            <w:r>
-              <w:t xml:space="preserve">대표 기술</w:t>
+              <w:t xml:space="preserve">변수</w:t>
+            </w:r>
+          </w:p>
+        </w:tc>
+        <w:tc>
+          <w:tcPr/>
+          <w:p>
+            <w:pPr>
+              <w:pStyle w:val="Compact"/>
+            </w:pPr>
+            <w:r>
+              <w:t xml:space="preserve">정의</w:t>
+            </w:r>
+          </w:p>
+        </w:tc>
+        <w:tc>
+          <w:tcPr/>
+          <w:p>
+            <w:pPr>
+              <w:pStyle w:val="Compact"/>
+            </w:pPr>
+            <w:r>
+              <w:t xml:space="preserve">유형</w:t>
             </w:r>
           </w:p>
         </w:tc>
@@ -1228,29 +1693,29 @@
               <w:pStyle w:val="Compact"/>
             </w:pPr>
             <w:r>
-              <w:t xml:space="preserve">H01L21</w:t>
-            </w:r>
-          </w:p>
-        </w:tc>
-        <w:tc>
-          <w:tcPr/>
-          <w:p>
-            <w:pPr>
-              <w:pStyle w:val="Compact"/>
-            </w:pPr>
-            <w:r>
-              <w:t xml:space="preserve">반도체 장치의 제조 또는 처리에 특별히 적합한 공정 또는 장치</w:t>
-            </w:r>
-          </w:p>
-        </w:tc>
-        <w:tc>
-          <w:tcPr/>
-          <w:p>
-            <w:pPr>
-              <w:pStyle w:val="Compact"/>
-            </w:pPr>
-            <w:r>
-              <w:t xml:space="preserve">리소그래피, 식각, 증착, 이온주입, 화학적 기계연마, 웨이퍼 세정·가공(전공정 및 후공정 제조공정)</w:t>
+              <w:t xml:space="preserve">breadth</w:t>
+            </w:r>
+          </w:p>
+        </w:tc>
+        <w:tc>
+          <w:tcPr/>
+          <w:p>
+            <w:pPr>
+              <w:pStyle w:val="Compact"/>
+            </w:pPr>
+            <w:r>
+              <w:t xml:space="preserve">출원의 고유 CPC 서브클래스 기호 수(기술범위)</w:t>
+            </w:r>
+          </w:p>
+        </w:tc>
+        <w:tc>
+          <w:tcPr/>
+          <w:p>
+            <w:pPr>
+              <w:pStyle w:val="Compact"/>
+            </w:pPr>
+            <w:r>
+              <w:t xml:space="preserve">카운트, 1–21</w:t>
             </w:r>
           </w:p>
         </w:tc>
@@ -1263,29 +1728,29 @@
               <w:pStyle w:val="Compact"/>
             </w:pPr>
             <w:r>
-              <w:t xml:space="preserve">H01L24</w:t>
-            </w:r>
-          </w:p>
-        </w:tc>
-        <w:tc>
-          <w:tcPr/>
-          <w:p>
-            <w:pPr>
-              <w:pStyle w:val="Compact"/>
-            </w:pPr>
-            <w:r>
-              <w:t xml:space="preserve">반도체 바디의 연결 또는 분리를 위한 배치; 관련 방법 또는 장치</w:t>
-            </w:r>
-          </w:p>
-        </w:tc>
-        <w:tc>
-          <w:tcPr/>
-          <w:p>
-            <w:pPr>
-              <w:pStyle w:val="Compact"/>
-            </w:pPr>
-            <w:r>
-              <w:t xml:space="preserve">와이어 본딩, 플립칩 본딩, 실리콘 관통 전극, 하이브리드 본딩, 솔더 범프/볼 형성, 재배선(패키징 인터커넥션)</w:t>
+              <w:t xml:space="preserve">has_process</w:t>
+            </w:r>
+          </w:p>
+        </w:tc>
+        <w:tc>
+          <w:tcPr/>
+          <w:p>
+            <w:pPr>
+              <w:pStyle w:val="Compact"/>
+            </w:pPr>
+            <w:r>
+              <w:t xml:space="preserve">H01L21(제조공정) 기호를 하나라도 보유하면 1, 아니면 0</w:t>
+            </w:r>
+          </w:p>
+        </w:tc>
+        <w:tc>
+          <w:tcPr/>
+          <w:p>
+            <w:pPr>
+              <w:pStyle w:val="Compact"/>
+            </w:pPr>
+            <w:r>
+              <w:t xml:space="preserve">이항</w:t>
             </w:r>
           </w:p>
         </w:tc>
@@ -1298,29 +1763,99 @@
               <w:pStyle w:val="Compact"/>
             </w:pPr>
             <w:r>
-              <w:t xml:space="preserve">H01L2224</w:t>
-            </w:r>
-          </w:p>
-        </w:tc>
-        <w:tc>
-          <w:tcPr/>
-          <w:p>
-            <w:pPr>
-              <w:pStyle w:val="Compact"/>
-            </w:pPr>
-            <w:r>
-              <w:t xml:space="preserve">반도체 바디의 연결·분리 배치에 대한 인덱싱 스킴</w:t>
-            </w:r>
-          </w:p>
-        </w:tc>
-        <w:tc>
-          <w:tcPr/>
-          <w:p>
-            <w:pPr>
-              <w:pStyle w:val="Compact"/>
-            </w:pPr>
-            <w:r>
-              <w:t xml:space="preserve">접합 금속, 접합 형태, 장비(예: H01L2224/08145: 금속–금속 및 유전체–유전체 접합을 결합한 직접 접합)</w:t>
+              <w:t xml:space="preserve">tech_cat</w:t>
+            </w:r>
+          </w:p>
+        </w:tc>
+        <w:tc>
+          <w:tcPr/>
+          <w:p>
+            <w:pPr>
+              <w:pStyle w:val="Compact"/>
+            </w:pPr>
+            <w:r>
+              <w:t xml:space="preserve">조립 단독형(H01L24만) / 통합형(둘 다) / 공정 단독형(H01L21만)</w:t>
+            </w:r>
+          </w:p>
+        </w:tc>
+        <w:tc>
+          <w:tcPr/>
+          <w:p>
+            <w:pPr>
+              <w:pStyle w:val="Compact"/>
+            </w:pPr>
+            <w:r>
+              <w:t xml:space="preserve">범주, 3</w:t>
+            </w:r>
+          </w:p>
+        </w:tc>
+      </w:tr>
+      <w:tr>
+        <w:tc>
+          <w:tcPr/>
+          <w:p>
+            <w:pPr>
+              <w:pStyle w:val="Compact"/>
+            </w:pPr>
+            <w:r>
+              <w:t xml:space="preserve">ccode</w:t>
+            </w:r>
+          </w:p>
+        </w:tc>
+        <w:tc>
+          <w:tcPr/>
+          <w:p>
+            <w:pPr>
+              <w:pStyle w:val="Compact"/>
+            </w:pPr>
+            <w:r>
+              <w:t xml:space="preserve">출원청: US(기준), CN, KR, TW, JP, EP, WO, 기타</w:t>
+            </w:r>
+          </w:p>
+        </w:tc>
+        <w:tc>
+          <w:tcPr/>
+          <w:p>
+            <w:pPr>
+              <w:pStyle w:val="Compact"/>
+            </w:pPr>
+            <w:r>
+              <w:t xml:space="preserve">범주, 8</w:t>
+            </w:r>
+          </w:p>
+        </w:tc>
+      </w:tr>
+      <w:tr>
+        <w:tc>
+          <w:tcPr/>
+          <w:p>
+            <w:pPr>
+              <w:pStyle w:val="Compact"/>
+            </w:pPr>
+            <w:r>
+              <w:t xml:space="preserve">yc</w:t>
+            </w:r>
+          </w:p>
+        </w:tc>
+        <w:tc>
+          <w:tcPr/>
+          <w:p>
+            <w:pPr>
+              <w:pStyle w:val="Compact"/>
+            </w:pPr>
+            <w:r>
+              <w:t xml:space="preserve">출원연도, 표본 최초 출원 이후 경과 연수</w:t>
+            </w:r>
+          </w:p>
+        </w:tc>
+        <w:tc>
+          <w:tcPr/>
+          <w:p>
+            <w:pPr>
+              <w:pStyle w:val="Compact"/>
+            </w:pPr>
+            <w:r>
+              <w:t xml:space="preserve">연속</w:t>
             </w:r>
           </w:p>
         </w:tc>
@@ -1331,75 +1866,7 @@
         <w:pStyle w:val="BodyText"/>
       </w:pPr>
       <w:r>
-        <w:t xml:space="preserve">검색은 두 단계로 이루어졌다. (1) H01L21과 H01L24 및 그 인덱싱 코드에 대한 CPC 1차 필터; (2)</w:t>
-      </w:r>
-      <w:r>
-        <w:t xml:space="preserve"> </w:t>
-      </w:r>
-      <w:r>
-        <w:rPr>
-          <w:i/>
-          <w:iCs/>
-        </w:rPr>
-        <w:t xml:space="preserve">hybrid bonding</w:t>
-      </w:r>
-      <w:r>
-        <w:t xml:space="preserve">,</w:t>
-      </w:r>
-      <w:r>
-        <w:t xml:space="preserve"> </w:t>
-      </w:r>
-      <w:r>
-        <w:rPr>
-          <w:i/>
-          <w:iCs/>
-        </w:rPr>
-        <w:t xml:space="preserve">direct bonding</w:t>
-      </w:r>
-      <w:r>
-        <w:t xml:space="preserve">,</w:t>
-      </w:r>
-      <w:r>
-        <w:t xml:space="preserve"> </w:t>
-      </w:r>
-      <w:r>
-        <w:rPr>
-          <w:i/>
-          <w:iCs/>
-        </w:rPr>
-        <w:t xml:space="preserve">Cu–Cu</w:t>
-      </w:r>
-      <w:r>
-        <w:t xml:space="preserve">,</w:t>
-      </w:r>
-      <w:r>
-        <w:t xml:space="preserve"> </w:t>
-      </w:r>
-      <w:r>
-        <w:rPr>
-          <w:i/>
-          <w:iCs/>
-        </w:rPr>
-        <w:t xml:space="preserve">copper to copper</w:t>
-      </w:r>
-      <w:r>
-        <w:t xml:space="preserve">,</w:t>
-      </w:r>
-      <w:r>
-        <w:t xml:space="preserve"> </w:t>
-      </w:r>
-      <w:r>
-        <w:rPr>
-          <w:i/>
-          <w:iCs/>
-        </w:rPr>
-        <w:t xml:space="preserve">metal-oxide bond</w:t>
-      </w:r>
-      <w:r>
-        <w:t xml:space="preserve"> </w:t>
-      </w:r>
-      <w:r>
-        <w:t xml:space="preserve">를 결합한 키워드 2차 필터(그림 1).</w:t>
+        <w:t xml:space="preserve">기술범위는 평균 5.69개 서브클래스(표준편차 4.07, 범위 1–21)다. 미국 출원청이 382건으로 가장 많고, 중국(175), PCT 경로(113), EPO(83), 대만(75), 한국(58), 일본(26), 기타(16)가 뒤를 잇는다. 그림 1는 출원연도 프로필을 보여준다. 2010년 이전에는 활동이 미미하다가 2010년대 후반에 가파르게 상승하여 2022년경 정점에 이르고, 2023–2024년의 하락은 실제 감소가 아니라 최근 출원이 공개되기까지의 시차를 반영한다. 전략 유형별로는 425건(45.8%)이 통합형, 338건(36.4%)이 조립 단독형, 165건(17.8%)이 공정 단독형이며, 합계 590건, 즉 63.6%가 적어도 하나의 제조공정 기호를 보유한다.</w:t>
       </w:r>
     </w:p>
     <w:p>
@@ -1409,483 +1876,20 @@
       <w:r>
         <w:drawing>
           <wp:inline>
-            <wp:extent cx="5334000" cy="1453042"/>
+            <wp:extent cx="5334000" cy="3878580"/>
             <wp:effectExtent b="0" l="0" r="0" t="0"/>
-            <wp:docPr descr="" title="" id="19" name="Picture"/>
+            <wp:docPr descr="" title="" id="20" name="Picture"/>
             <a:graphic>
               <a:graphicData uri="http://schemas.openxmlformats.org/drawingml/2006/picture">
                 <pic:pic>
                   <pic:nvPicPr>
-                    <pic:cNvPr descr="figures/figA1_search_strategy.png" id="20" name="Picture"/>
+                    <pic:cNvPr descr="figures/fig4_applications_by_year.png" id="21" name="Picture"/>
                     <pic:cNvPicPr>
                       <a:picLocks noChangeArrowheads="1" noChangeAspect="1"/>
                     </pic:cNvPicPr>
                   </pic:nvPicPr>
                   <pic:blipFill>
-                    <a:blip r:embed="rId18"/>
-                    <a:stretch>
-                      <a:fillRect/>
-                    </a:stretch>
-                  </pic:blipFill>
-                  <pic:spPr bwMode="auto">
-                    <a:xfrm>
-                      <a:off x="0" y="0"/>
-                      <a:ext cx="5334000" cy="1453042"/>
-                    </a:xfrm>
-                    <a:prstGeom prst="rect">
-                      <a:avLst/>
-                    </a:prstGeom>
-                    <a:noFill/>
-                    <a:ln w="9525">
-                      <a:noFill/>
-                      <a:headEnd/>
-                      <a:tailEnd/>
-                    </a:ln>
-                  </pic:spPr>
-                </pic:pic>
-              </a:graphicData>
-            </a:graphic>
-          </wp:inline>
-        </w:drawing>
-      </w:r>
-    </w:p>
-    <w:p>
-      <w:pPr>
-        <w:pStyle w:val="BodyText"/>
-      </w:pPr>
-      <w:r>
-        <w:rPr>
-          <w:b/>
-          <w:bCs/>
-        </w:rPr>
-        <w:t xml:space="preserve">그림 1.</w:t>
-      </w:r>
-      <w:r>
-        <w:t xml:space="preserve"> </w:t>
-      </w:r>
-      <w:r>
-        <w:t xml:space="preserve">하이브리드 본딩 모집단의 검색 전략(CPC 1차 필터와 키워드 2차 필터).</w:t>
-      </w:r>
-    </w:p>
-    <w:bookmarkEnd w:id="21"/>
-    <w:bookmarkStart w:id="25" w:name="변수"/>
-    <w:p>
-      <w:pPr>
-        <w:pStyle w:val="Heading3"/>
-      </w:pPr>
-      <w:r>
-        <w:t xml:space="preserve">4.2 변수</w:t>
-      </w:r>
-    </w:p>
-    <w:p>
-      <w:pPr>
-        <w:pStyle w:val="FirstParagraph"/>
-      </w:pPr>
-      <w:r>
-        <w:t xml:space="preserve">표 2는 변수를 정의한다.</w:t>
-      </w:r>
-      <w:r>
-        <w:t xml:space="preserve"> </w:t>
-      </w:r>
-      <w:r>
-        <w:rPr>
-          <w:i/>
-          <w:iCs/>
-        </w:rPr>
-        <w:t xml:space="preserve">기술범위(breadth)</w:t>
-      </w:r>
-      <w:r>
-        <w:t xml:space="preserve"> </w:t>
-      </w:r>
-      <w:r>
-        <w:t xml:space="preserve">는 출원에 부여된 고유 CPC 서브클래스 기호의 수로, Lerner(1994)의 전통에 따른 기술범위의 측정치다.</w:t>
-      </w:r>
-      <w:r>
-        <w:t xml:space="preserve"> </w:t>
-      </w:r>
-      <w:r>
-        <w:rPr>
-          <w:i/>
-          <w:iCs/>
-        </w:rPr>
-        <w:t xml:space="preserve">Has_process</w:t>
-      </w:r>
-      <w:r>
-        <w:t xml:space="preserve"> </w:t>
-      </w:r>
-      <w:r>
-        <w:t xml:space="preserve">는 출원이 H01L21 기호를 하나라도 보유하면 1인 이항 지표로, 경계 넘기의 측정치다.</w:t>
-      </w:r>
-      <w:r>
-        <w:t xml:space="preserve"> </w:t>
-      </w:r>
-      <w:r>
-        <w:rPr>
-          <w:i/>
-          <w:iCs/>
-        </w:rPr>
-        <w:t xml:space="preserve">Tech_cat</w:t>
-      </w:r>
-      <w:r>
-        <w:t xml:space="preserve"> </w:t>
-      </w:r>
-      <w:r>
-        <w:t xml:space="preserve">은 각 출원을 상호배타적인 세 전략 유형, 즉</w:t>
-      </w:r>
-      <w:r>
-        <w:t xml:space="preserve"> </w:t>
-      </w:r>
-      <w:r>
-        <w:rPr>
-          <w:i/>
-          <w:iCs/>
-        </w:rPr>
-        <w:t xml:space="preserve">조립 단독형(assembly-only)</w:t>
-      </w:r>
-      <w:r>
-        <w:t xml:space="preserve"> </w:t>
-      </w:r>
-      <w:r>
-        <w:t xml:space="preserve">(H01L24 기호만),</w:t>
-      </w:r>
-      <w:r>
-        <w:t xml:space="preserve"> </w:t>
-      </w:r>
-      <w:r>
-        <w:rPr>
-          <w:i/>
-          <w:iCs/>
-        </w:rPr>
-        <w:t xml:space="preserve">통합형(integrated)</w:t>
-      </w:r>
-      <w:r>
-        <w:t xml:space="preserve"> </w:t>
-      </w:r>
-      <w:r>
-        <w:t xml:space="preserve">(H01L24와 H01L21 모두),</w:t>
-      </w:r>
-      <w:r>
-        <w:t xml:space="preserve"> </w:t>
-      </w:r>
-      <w:r>
-        <w:rPr>
-          <w:i/>
-          <w:iCs/>
-        </w:rPr>
-        <w:t xml:space="preserve">공정 단독형(process-only)</w:t>
-      </w:r>
-      <w:r>
-        <w:t xml:space="preserve"> </w:t>
-      </w:r>
-      <w:r>
-        <w:t xml:space="preserve">(H01L21 기호만)에 배정한다.</w:t>
-      </w:r>
-      <w:r>
-        <w:t xml:space="preserve"> </w:t>
-      </w:r>
-      <w:r>
-        <w:rPr>
-          <w:i/>
-          <w:iCs/>
-        </w:rPr>
-        <w:t xml:space="preserve">Ccode</w:t>
-      </w:r>
-      <w:r>
-        <w:t xml:space="preserve"> </w:t>
-      </w:r>
-      <w:r>
-        <w:t xml:space="preserve">는 출원이 제출된 출원청으로, 8개 수준(US, CN, KR, TW, JP, EP, WO, 기타)이며 미국 출원청이 기준이다.</w:t>
-      </w:r>
-      <w:r>
-        <w:t xml:space="preserve"> </w:t>
-      </w:r>
-      <w:r>
-        <w:rPr>
-          <w:i/>
-          <w:iCs/>
-        </w:rPr>
-        <w:t xml:space="preserve">Yc</w:t>
-      </w:r>
-      <w:r>
-        <w:t xml:space="preserve"> </w:t>
-      </w:r>
-      <w:r>
-        <w:t xml:space="preserve">는 표본 최초 출원 이후 경과 연수로 측정한 출원연도다.</w:t>
-      </w:r>
-    </w:p>
-    <w:p>
-      <w:pPr>
-        <w:pStyle w:val="BodyText"/>
-      </w:pPr>
-      <w:r>
-        <w:rPr>
-          <w:b/>
-          <w:bCs/>
-        </w:rPr>
-        <w:t xml:space="preserve">표 2.</w:t>
-      </w:r>
-      <w:r>
-        <w:t xml:space="preserve"> </w:t>
-      </w:r>
-      <w:r>
-        <w:t xml:space="preserve">변수 정의.</w:t>
-      </w:r>
-    </w:p>
-    <w:tbl>
-      <w:tblPr>
-        <w:tblStyle w:val="Table"/>
-        <w:tblW w:type="pct" w:w="5000"/>
-        <w:tblLayout w:type="fixed"/>
-        <w:tblLook w:firstRow="1" w:lastRow="0" w:firstColumn="0" w:lastColumn="0" w:noHBand="0" w:noVBand="0" w:val="0020"/>
-      </w:tblPr>
-      <w:tblGrid>
-        <w:gridCol w:w="2640"/>
-        <w:gridCol w:w="2640"/>
-        <w:gridCol w:w="2640"/>
-      </w:tblGrid>
-      <w:tr>
-        <w:trPr>
-          <w:tblHeader w:val="on"/>
-        </w:trPr>
-        <w:tc>
-          <w:tcPr/>
-          <w:p>
-            <w:pPr>
-              <w:pStyle w:val="Compact"/>
-            </w:pPr>
-            <w:r>
-              <w:t xml:space="preserve">변수</w:t>
-            </w:r>
-          </w:p>
-        </w:tc>
-        <w:tc>
-          <w:tcPr/>
-          <w:p>
-            <w:pPr>
-              <w:pStyle w:val="Compact"/>
-            </w:pPr>
-            <w:r>
-              <w:t xml:space="preserve">정의</w:t>
-            </w:r>
-          </w:p>
-        </w:tc>
-        <w:tc>
-          <w:tcPr/>
-          <w:p>
-            <w:pPr>
-              <w:pStyle w:val="Compact"/>
-            </w:pPr>
-            <w:r>
-              <w:t xml:space="preserve">유형</w:t>
-            </w:r>
-          </w:p>
-        </w:tc>
-      </w:tr>
-      <w:tr>
-        <w:tc>
-          <w:tcPr/>
-          <w:p>
-            <w:pPr>
-              <w:pStyle w:val="Compact"/>
-            </w:pPr>
-            <w:r>
-              <w:t xml:space="preserve">breadth</w:t>
-            </w:r>
-          </w:p>
-        </w:tc>
-        <w:tc>
-          <w:tcPr/>
-          <w:p>
-            <w:pPr>
-              <w:pStyle w:val="Compact"/>
-            </w:pPr>
-            <w:r>
-              <w:t xml:space="preserve">출원의 고유 CPC 서브클래스 기호 수(기술범위)</w:t>
-            </w:r>
-          </w:p>
-        </w:tc>
-        <w:tc>
-          <w:tcPr/>
-          <w:p>
-            <w:pPr>
-              <w:pStyle w:val="Compact"/>
-            </w:pPr>
-            <w:r>
-              <w:t xml:space="preserve">카운트, 1–21</w:t>
-            </w:r>
-          </w:p>
-        </w:tc>
-      </w:tr>
-      <w:tr>
-        <w:tc>
-          <w:tcPr/>
-          <w:p>
-            <w:pPr>
-              <w:pStyle w:val="Compact"/>
-            </w:pPr>
-            <w:r>
-              <w:t xml:space="preserve">has_process</w:t>
-            </w:r>
-          </w:p>
-        </w:tc>
-        <w:tc>
-          <w:tcPr/>
-          <w:p>
-            <w:pPr>
-              <w:pStyle w:val="Compact"/>
-            </w:pPr>
-            <w:r>
-              <w:t xml:space="preserve">H01L21(제조공정) 기호를 하나라도 보유하면 1, 아니면 0</w:t>
-            </w:r>
-          </w:p>
-        </w:tc>
-        <w:tc>
-          <w:tcPr/>
-          <w:p>
-            <w:pPr>
-              <w:pStyle w:val="Compact"/>
-            </w:pPr>
-            <w:r>
-              <w:t xml:space="preserve">이항</w:t>
-            </w:r>
-          </w:p>
-        </w:tc>
-      </w:tr>
-      <w:tr>
-        <w:tc>
-          <w:tcPr/>
-          <w:p>
-            <w:pPr>
-              <w:pStyle w:val="Compact"/>
-            </w:pPr>
-            <w:r>
-              <w:t xml:space="preserve">tech_cat</w:t>
-            </w:r>
-          </w:p>
-        </w:tc>
-        <w:tc>
-          <w:tcPr/>
-          <w:p>
-            <w:pPr>
-              <w:pStyle w:val="Compact"/>
-            </w:pPr>
-            <w:r>
-              <w:t xml:space="preserve">조립 단독형(H01L24만) / 통합형(둘 다) / 공정 단독형(H01L21만)</w:t>
-            </w:r>
-          </w:p>
-        </w:tc>
-        <w:tc>
-          <w:tcPr/>
-          <w:p>
-            <w:pPr>
-              <w:pStyle w:val="Compact"/>
-            </w:pPr>
-            <w:r>
-              <w:t xml:space="preserve">범주, 3</w:t>
-            </w:r>
-          </w:p>
-        </w:tc>
-      </w:tr>
-      <w:tr>
-        <w:tc>
-          <w:tcPr/>
-          <w:p>
-            <w:pPr>
-              <w:pStyle w:val="Compact"/>
-            </w:pPr>
-            <w:r>
-              <w:t xml:space="preserve">ccode</w:t>
-            </w:r>
-          </w:p>
-        </w:tc>
-        <w:tc>
-          <w:tcPr/>
-          <w:p>
-            <w:pPr>
-              <w:pStyle w:val="Compact"/>
-            </w:pPr>
-            <w:r>
-              <w:t xml:space="preserve">출원청: US(기준), CN, KR, TW, JP, EP, WO, 기타</w:t>
-            </w:r>
-          </w:p>
-        </w:tc>
-        <w:tc>
-          <w:tcPr/>
-          <w:p>
-            <w:pPr>
-              <w:pStyle w:val="Compact"/>
-            </w:pPr>
-            <w:r>
-              <w:t xml:space="preserve">범주, 8</w:t>
-            </w:r>
-          </w:p>
-        </w:tc>
-      </w:tr>
-      <w:tr>
-        <w:tc>
-          <w:tcPr/>
-          <w:p>
-            <w:pPr>
-              <w:pStyle w:val="Compact"/>
-            </w:pPr>
-            <w:r>
-              <w:t xml:space="preserve">yc</w:t>
-            </w:r>
-          </w:p>
-        </w:tc>
-        <w:tc>
-          <w:tcPr/>
-          <w:p>
-            <w:pPr>
-              <w:pStyle w:val="Compact"/>
-            </w:pPr>
-            <w:r>
-              <w:t xml:space="preserve">출원연도, 표본 최초 출원 이후 경과 연수</w:t>
-            </w:r>
-          </w:p>
-        </w:tc>
-        <w:tc>
-          <w:tcPr/>
-          <w:p>
-            <w:pPr>
-              <w:pStyle w:val="Compact"/>
-            </w:pPr>
-            <w:r>
-              <w:t xml:space="preserve">연속</w:t>
-            </w:r>
-          </w:p>
-        </w:tc>
-      </w:tr>
-    </w:tbl>
-    <w:p>
-      <w:pPr>
-        <w:pStyle w:val="BodyText"/>
-      </w:pPr>
-      <w:r>
-        <w:t xml:space="preserve">기술범위는 평균 5.69개 서브클래스(표준편차 4.07, 범위 1–21)다. 미국 출원청이 382건으로 가장 많고, 중국(175), PCT 경로(113), EPO(83), 대만(75), 한국(58), 일본(26), 기타(16)가 뒤를 잇는다. 그림 2는 출원연도 프로필을 보여준다. 2010년 이전에는 활동이 미미하다가 2010년대 후반에 가파르게 상승하여 2022년경 정점에 이르고, 2023–2024년의 하락은 실제 감소가 아니라 최근 출원이 공개되기까지의 시차를 반영한다. 전략 유형별로는 425건(45.8%)이 통합형, 338건(36.4%)이 조립 단독형, 165건(17.8%)이 공정 단독형이며, 합계 590건, 즉 63.6%가 적어도 하나의 제조공정 기호를 보유한다.</w:t>
-      </w:r>
-    </w:p>
-    <w:p>
-      <w:pPr>
-        <w:pStyle w:val="BodyText"/>
-      </w:pPr>
-      <w:r>
-        <w:drawing>
-          <wp:inline>
-            <wp:extent cx="5334000" cy="3878580"/>
-            <wp:effectExtent b="0" l="0" r="0" t="0"/>
-            <wp:docPr descr="" title="" id="23" name="Picture"/>
-            <a:graphic>
-              <a:graphicData uri="http://schemas.openxmlformats.org/drawingml/2006/picture">
-                <pic:pic>
-                  <pic:nvPicPr>
-                    <pic:cNvPr descr="figures/fig4_applications_by_year.png" id="24" name="Picture"/>
-                    <pic:cNvPicPr>
-                      <a:picLocks noChangeArrowheads="1" noChangeAspect="1"/>
-                    </pic:cNvPicPr>
-                  </pic:nvPicPr>
-                  <pic:blipFill>
-                    <a:blip r:embed="rId22"/>
+                    <a:blip r:embed="rId19"/>
                     <a:stretch>
                       <a:fillRect/>
                     </a:stretch>
@@ -1921,7 +1925,7 @@
           <w:b/>
           <w:bCs/>
         </w:rPr>
-        <w:t xml:space="preserve">그림 2.</w:t>
+        <w:t xml:space="preserve">그림 1.</w:t>
       </w:r>
       <w:r>
         <w:t xml:space="preserve"> </w:t>
@@ -1954,8 +1958,8 @@
         <w:t xml:space="preserve">는 출원이 제출된 출원청이지 출원인의 국적이 아니며, WO와 EP는 국가가 아니라 국제·지역 출원 경로다. 따라서 출원청 간 차이는 발명의 기원뿐 아니라 출원·보호 전략을 반영하며, 본 연구는 이를 일관되게 그러한 관점에서 해석한다.</w:t>
       </w:r>
     </w:p>
-    <w:bookmarkEnd w:id="25"/>
-    <w:bookmarkStart w:id="26" w:name="실증-전략"/>
+    <w:bookmarkEnd w:id="22"/>
+    <w:bookmarkStart w:id="23" w:name="실증-전략"/>
     <w:p>
       <w:pPr>
         <w:pStyle w:val="Heading3"/>
@@ -2028,9 +2032,9 @@
         <w:t xml:space="preserve">을 모형화하고 상대위험비(RRR)로 보고하여, 통합형과 공정 단독형을 동일한 기준 범주 대비로 해석할 수 있게 한다. 다항 로짓은 무관 대안의 독립성(IIA)에 의존하므로, 그 추정치를 기준 범주 대비 상대적 경향으로 해석하고 절대 확률에 관한 인과적 진술은 삼간다. 카운트 모형에서는 로버스트 표준오차를 병행 산출하였으며, 추정치 변화가 미미하여 선형 벤치마크의 문제가 오차 구조가 아니라 함수 형태에 있음을 확인하였다.</w:t>
       </w:r>
     </w:p>
-    <w:bookmarkEnd w:id="26"/>
-    <w:bookmarkEnd w:id="27"/>
-    <w:bookmarkStart w:id="41" w:name="결과"/>
+    <w:bookmarkEnd w:id="23"/>
+    <w:bookmarkEnd w:id="24"/>
+    <w:bookmarkStart w:id="38" w:name="결과"/>
     <w:p>
       <w:pPr>
         <w:pStyle w:val="Heading2"/>
@@ -2039,7 +2043,7 @@
         <w:t xml:space="preserve">5. 결과</w:t>
       </w:r>
     </w:p>
-    <w:bookmarkStart w:id="31" w:name="기술범위"/>
+    <w:bookmarkStart w:id="28" w:name="기술범위"/>
     <w:p>
       <w:pPr>
         <w:pStyle w:val="Heading3"/>
@@ -2875,7 +2879,7 @@
         <w:pStyle w:val="BodyText"/>
       </w:pPr>
       <w:r>
-        <w:t xml:space="preserve">세 가지 패턴이 확인된다. 첫째, 분야가 성숙하면서 범위가 넓어졌다. 연도 추세의 발생률비(IRR)는 1.014로, 서브클래스 수가 연간 약 1.4%씩 증가한다. 둘째, 미국 기준 대비 중국 출원청 출원은 약 21% 좁고(IRR 0.785, p &lt; 0.01) PCT 출원은 약 17% 좁은(IRR 0.826, p &lt; 0.01) 반면, 일본 출원청 출원은 표본에서 가장 넓다(IRR 1.270, p &lt; 0.10). 셋째, 한국(IRR 1.017), 대만(1.021), EPO(0.993)는 미국 기준과 구분되지 않는다. 그림 3은 모형이 함의하는 출원청별 예측 기술범위를 도시한다. 일본 출원청 출원이 더 넓다는 H3b의 범위 성분은 10% 수준에서 지지되며, 중국 출원청 출원의 좁음은 H3a에 대해 제시한 추격 해석과 부합한다.</w:t>
+        <w:t xml:space="preserve">세 가지 패턴이 확인된다. 첫째, 분야가 성숙하면서 범위가 넓어졌다. 연도 추세의 발생률비(IRR)는 1.014로, 서브클래스 수가 연간 약 1.4%씩 증가한다. 둘째, 미국 기준 대비 중국 출원청 출원은 약 21% 좁고(IRR 0.785, p &lt; 0.01) PCT 출원은 약 17% 좁은(IRR 0.826, p &lt; 0.01) 반면, 일본 출원청 출원은 표본에서 가장 넓다(IRR 1.270, p &lt; 0.10). 셋째, 한국(IRR 1.017), 대만(1.021), EPO(0.993)는 미국 기준과 구분되지 않는다. 그림 1은 모형이 함의하는 출원청별 예측 기술범위를 도시한다. 일본 출원청 출원이 더 넓다는 H3b의 범위 성분은 10% 수준에서 지지되며, 중국 출원청 출원의 좁음은 H3a에 대해 제시한 추격 해석과 부합한다.</w:t>
       </w:r>
     </w:p>
     <w:p>
@@ -2887,18 +2891,18 @@
           <wp:inline>
             <wp:extent cx="5334000" cy="3878580"/>
             <wp:effectExtent b="0" l="0" r="0" t="0"/>
-            <wp:docPr descr="" title="" id="29" name="Picture"/>
+            <wp:docPr descr="" title="" id="26" name="Picture"/>
             <a:graphic>
               <a:graphicData uri="http://schemas.openxmlformats.org/drawingml/2006/picture">
                 <pic:pic>
                   <pic:nvPicPr>
-                    <pic:cNvPr descr="figures/fig5_predicted_breadth.png" id="30" name="Picture"/>
+                    <pic:cNvPr descr="figures/fig5_predicted_breadth.png" id="27" name="Picture"/>
                     <pic:cNvPicPr>
                       <a:picLocks noChangeArrowheads="1" noChangeAspect="1"/>
                     </pic:cNvPicPr>
                   </pic:nvPicPr>
                   <pic:blipFill>
-                    <a:blip r:embed="rId28"/>
+                    <a:blip r:embed="rId25"/>
                     <a:stretch>
                       <a:fillRect/>
                     </a:stretch>
@@ -2934,7 +2938,7 @@
           <w:b/>
           <w:bCs/>
         </w:rPr>
-        <w:t xml:space="preserve">그림 3.</w:t>
+        <w:t xml:space="preserve">그림 1.</w:t>
       </w:r>
       <w:r>
         <w:t xml:space="preserve"> </w:t>
@@ -2943,8 +2947,8 @@
         <w:t xml:space="preserve">출원청별 예측 기술범위(음이항, 다른 공변량은 평균; 95% 신뢰구간).</w:t>
       </w:r>
     </w:p>
-    <w:bookmarkEnd w:id="31"/>
-    <w:bookmarkStart w:id="35" w:name="경계-넘기-이항-로짓"/>
+    <w:bookmarkEnd w:id="28"/>
+    <w:bookmarkStart w:id="32" w:name="경계-넘기-이항-로짓"/>
     <w:p>
       <w:pPr>
         <w:pStyle w:val="Heading3"/>
@@ -2990,7 +2994,7 @@
         <w:t xml:space="preserve"> </w:t>
       </w:r>
       <w:r>
-        <w:t xml:space="preserve">이 감소한 것이다. 출원청 중에서는 중국 출원청만 미국 기준과 유의하게 다르며, 공정 청구의 승산이 65% 높다(OR 1.650, p &lt; 0.05). 이는 H3a를 지지한다. 일본 출원청의 승산비는 1 미만(0.483)이지만 26건에 기반하므로 추정이 부정확하다. 모형의 판별력은 수용 가능한 수준으로, ROC 곡선 하면적은 0.707이다(그림 4).</w:t>
+        <w:t xml:space="preserve">이 감소한 것이다. 출원청 중에서는 중국 출원청만 미국 기준과 유의하게 다르며, 공정 청구의 승산이 65% 높다(OR 1.650, p &lt; 0.05). 이는 H3a를 지지한다. 일본 출원청의 승산비는 1 미만(0.483)이지만 26건에 기반하므로 추정이 부정확하다. 모형의 판별력은 수용 가능한 수준으로, ROC 곡선 하면적은 0.707이다(그림 1).</w:t>
       </w:r>
     </w:p>
     <w:p>
@@ -3431,18 +3435,18 @@
           <wp:inline>
             <wp:extent cx="5334000" cy="3878580"/>
             <wp:effectExtent b="0" l="0" r="0" t="0"/>
-            <wp:docPr descr="" title="" id="33" name="Picture"/>
+            <wp:docPr descr="" title="" id="30" name="Picture"/>
             <a:graphic>
               <a:graphicData uri="http://schemas.openxmlformats.org/drawingml/2006/picture">
                 <pic:pic>
                   <pic:nvPicPr>
-                    <pic:cNvPr descr="figures/fig6_roc.png" id="34" name="Picture"/>
+                    <pic:cNvPr descr="figures/fig6_roc.png" id="31" name="Picture"/>
                     <pic:cNvPicPr>
                       <a:picLocks noChangeArrowheads="1" noChangeAspect="1"/>
                     </pic:cNvPicPr>
                   </pic:nvPicPr>
                   <pic:blipFill>
-                    <a:blip r:embed="rId32"/>
+                    <a:blip r:embed="rId29"/>
                     <a:stretch>
                       <a:fillRect/>
                     </a:stretch>
@@ -3478,7 +3482,7 @@
           <w:b/>
           <w:bCs/>
         </w:rPr>
-        <w:t xml:space="preserve">그림 4.</w:t>
+        <w:t xml:space="preserve">그림 1.</w:t>
       </w:r>
       <w:r>
         <w:t xml:space="preserve"> </w:t>
@@ -3487,8 +3491,8 @@
         <w:t xml:space="preserve">경계 넘기 로짓의 ROC 곡선(AUC = 0.707).</w:t>
       </w:r>
     </w:p>
-    <w:bookmarkEnd w:id="35"/>
-    <w:bookmarkStart w:id="39" w:name="전략-유형-다항-로짓"/>
+    <w:bookmarkEnd w:id="32"/>
+    <w:bookmarkStart w:id="36" w:name="전략-유형-다항-로짓"/>
     <w:p>
       <w:pPr>
         <w:pStyle w:val="Heading3"/>
@@ -4221,7 +4225,7 @@
         <w:pStyle w:val="BodyText"/>
       </w:pPr>
       <w:r>
-        <w:t xml:space="preserve">관할권 대비는 공정 단독형 갈래에 집중되어 있다. 중국 출원청은 미국 출원청보다 공정 단독형 특허의 상대위험이 훨씬 높고(RRR 2.687, p &lt; 0.01), 대만(RRR 2.102, p &lt; 0.10)과 PCT 경로(RRR 1.997, p &lt; 0.05)도 높은 반면, 일본 출원청은 거의 그렇지 않다(RRR 0.086, p &lt; 0.01). 통합형 갈래의 출원청 계수는 어느 것도 유의하지 않다. 범위와 시점을 통제하면 경계를 넘는 특허를 출원하는 성향은 출원청 간에 체계적으로 다르지 않다. 그림 5는 다른 공변량을 평균에 둔 채 출원청별 공정 단독형 전략의 예측 확률을 도시한다. 중국 출원청 출원은 약 4건 중 1건이 공정 단독형으로 예측되는 반면, 미국 출원청은 약 7건 중 1건, 일본 출원청은 약 50건 중 1건이다. H3a와 H3b의 전략 성분이 지지된다.</w:t>
+        <w:t xml:space="preserve">관할권 대비는 공정 단독형 갈래에 집중되어 있다. 중국 출원청은 미국 출원청보다 공정 단독형 특허의 상대위험이 훨씬 높고(RRR 2.687, p &lt; 0.01), 대만(RRR 2.102, p &lt; 0.10)과 PCT 경로(RRR 1.997, p &lt; 0.05)도 높은 반면, 일본 출원청은 거의 그렇지 않다(RRR 0.086, p &lt; 0.01). 통합형 갈래의 출원청 계수는 어느 것도 유의하지 않다. 범위와 시점을 통제하면 경계를 넘는 특허를 출원하는 성향은 출원청 간에 체계적으로 다르지 않다. 그림 1는 다른 공변량을 평균에 둔 채 출원청별 공정 단독형 전략의 예측 확률을 도시한다. 중국 출원청 출원은 약 4건 중 1건이 공정 단독형으로 예측되는 반면, 미국 출원청은 약 7건 중 1건, 일본 출원청은 약 50건 중 1건이다. H3a와 H3b의 전략 성분이 지지된다.</w:t>
       </w:r>
     </w:p>
     <w:p>
@@ -4233,18 +4237,18 @@
           <wp:inline>
             <wp:extent cx="5334000" cy="3455670"/>
             <wp:effectExtent b="0" l="0" r="0" t="0"/>
-            <wp:docPr descr="" title="" id="37" name="Picture"/>
+            <wp:docPr descr="" title="" id="34" name="Picture"/>
             <a:graphic>
               <a:graphicData uri="http://schemas.openxmlformats.org/drawingml/2006/picture">
                 <pic:pic>
                   <pic:nvPicPr>
-                    <pic:cNvPr descr="figures/fig7_predicted_process_only.png" id="38" name="Picture"/>
+                    <pic:cNvPr descr="figures/fig7_predicted_process_only.png" id="35" name="Picture"/>
                     <pic:cNvPicPr>
                       <a:picLocks noChangeArrowheads="1" noChangeAspect="1"/>
                     </pic:cNvPicPr>
                   </pic:nvPicPr>
                   <pic:blipFill>
-                    <a:blip r:embed="rId36"/>
+                    <a:blip r:embed="rId33"/>
                     <a:stretch>
                       <a:fillRect/>
                     </a:stretch>
@@ -4280,7 +4284,7 @@
           <w:b/>
           <w:bCs/>
         </w:rPr>
-        <w:t xml:space="preserve">그림 5.</w:t>
+        <w:t xml:space="preserve">그림 1.</w:t>
       </w:r>
       <w:r>
         <w:t xml:space="preserve"> </w:t>
@@ -4289,8 +4293,8 @@
         <w:t xml:space="preserve">출원청별 공정 단독형 전략의 예측 확률(다항 로짓, 다른 공변량은 평균; 95% 신뢰구간).</w:t>
       </w:r>
     </w:p>
-    <w:bookmarkEnd w:id="39"/>
-    <w:bookmarkStart w:id="40" w:name="가설-검정-요약과-강건성"/>
+    <w:bookmarkEnd w:id="36"/>
+    <w:bookmarkStart w:id="37" w:name="가설-검정-요약과-강건성"/>
     <w:p>
       <w:pPr>
         <w:pStyle w:val="Heading3"/>
@@ -4580,289 +4584,289 @@
         <w:t xml:space="preserve">결과의 강건성과 관련하여 세 가지를 점검하였다. 첫째, 카운트 모형의 선택이 범위 결과를 좌우하지 않는다. 연도와 중국 출원청 효과의 부호와 유의성은 OLS, 로버스트 OLS, Poisson, 음이항 명세에서 동일하며(표 3), 표준오차가 보정되면서 정밀도를 잃는 것은 일본 출원청 계수뿐이고, 이 때문에 이를 10% 수준에서 보고한다. 둘째, 2023–2024년의 출원 감소는 공개 시차의 인공물이다. 연도 추세가 1968–2024년 전 기간에 걸쳐 추정되고 모형이 연도를 선형으로 통제하므로, 절단은 추정 추세의 방향보다 최근 카운트의 수준에 영향을 미친다. 다만 공정 단독형의 감소를 절단된 연도까지 외삽하지는 않는다. 셋째, 다항 결과는 무관 대안의 독립성 가정에 따라 조립 단독형 기준 대비 상대적 경향으로 읽으며, 그 가정을 요구하지 않는 이항 로짓이 범위·시간·중국 출원청에 대해 같은 질적 결론을 준다.</w:t>
       </w:r>
     </w:p>
+    <w:bookmarkEnd w:id="37"/>
+    <w:bookmarkEnd w:id="38"/>
+    <w:bookmarkStart w:id="42" w:name="논의"/>
+    <w:p>
+      <w:pPr>
+        <w:pStyle w:val="Heading2"/>
+      </w:pPr>
+      <w:r>
+        <w:t xml:space="preserve">6. 논의</w:t>
+      </w:r>
+    </w:p>
+    <w:bookmarkStart w:id="39" w:name="이론적-함의"/>
+    <w:p>
+      <w:pPr>
+        <w:pStyle w:val="Heading3"/>
+      </w:pPr>
+      <w:r>
+        <w:t xml:space="preserve">6.1 이론적 함의</w:t>
+      </w:r>
+    </w:p>
+    <w:p>
+      <w:pPr>
+        <w:pStyle w:val="FirstParagraph"/>
+      </w:pPr>
+      <w:r>
+        <w:rPr>
+          <w:i/>
+          <w:iCs/>
+        </w:rPr>
+        <w:t xml:space="preserve">산업 내 융합.</w:t>
+      </w:r>
+      <w:r>
+        <w:t xml:space="preserve"> </w:t>
+      </w:r>
+      <w:r>
+        <w:t xml:space="preserve">첫 번째 함의는 융합 이론의 범위에 관한 것이다. 제2.1절에서 검토한 문헌은 융합을 산업</w:t>
+      </w:r>
+      <w:r>
+        <w:t xml:space="preserve"> </w:t>
+      </w:r>
+      <w:r>
+        <w:rPr>
+          <w:i/>
+          <w:iCs/>
+        </w:rPr>
+        <w:t xml:space="preserve">사이</w:t>
+      </w:r>
+      <w:r>
+        <w:t xml:space="preserve"> </w:t>
+      </w:r>
+      <w:r>
+        <w:t xml:space="preserve">에서 일어나는 것으로 다루며, 그 단계 모형은 한 산업의 지식이 다른 산업으로 이주하여 결국 산업 자체가 합쳐지는 과정을 기술한다(Hacklin et al., 2009; Curran and Leker, 2011). 본 연구의 결과는 같은 개념 장치가 반도체 제조의 제조 단계와 조립 단계 사이처럼 한 산업을</w:t>
+      </w:r>
+      <w:r>
+        <w:t xml:space="preserve"> </w:t>
+      </w:r>
+      <w:r>
+        <w:rPr>
+          <w:i/>
+          <w:iCs/>
+        </w:rPr>
+        <w:t xml:space="preserve">관통하는</w:t>
+      </w:r>
+      <w:r>
+        <w:t xml:space="preserve"> </w:t>
+      </w:r>
+      <w:r>
+        <w:t xml:space="preserve">경계에도 적용되며, 그 경계가 개별 발명 수준에서 관찰될 수 있음을 보인다. 하이브리드 본딩 특허의 거의 3분의 2가 전공정 기술을 청구하고, 최빈 특허는 통합형이다. Jacobides et al.(2006)의 견해대로 산업 아키텍처가 분업의 템플릿이라면, 이러한 산업 내 융합은 템플릿이 재협상되는 메커니즘이다. 단계 간 인터페이스가 안정성을 잃으면 발명이 그 양쪽을 모두 청구하기 시작하는 것이다.</w:t>
+      </w:r>
+    </w:p>
+    <w:p>
+      <w:pPr>
+        <w:pStyle w:val="BodyText"/>
+      </w:pPr>
+      <w:r>
+        <w:rPr>
+          <w:i/>
+          <w:iCs/>
+        </w:rPr>
+        <w:t xml:space="preserve">융합의 미시 메커니즘으로서의 범위.</w:t>
+      </w:r>
+      <w:r>
+        <w:t xml:space="preserve"> </w:t>
+      </w:r>
+      <w:r>
+        <w:t xml:space="preserve">두 번째 함의는 메커니즘에 관한 것이다. Kodama(1992)의 기술융합은 기업 R&amp;D 조직 수준에서 정식화되었고, 융합 지수는 분야 수준에서 정식화된다. 본 연구의 특허 수준 증거는 메커니즘을</w:t>
+      </w:r>
+      <w:r>
+        <w:t xml:space="preserve"> </w:t>
+      </w:r>
+      <w:r>
+        <w:rPr>
+          <w:i/>
+          <w:iCs/>
+        </w:rPr>
+        <w:t xml:space="preserve">개별 발명의 범위</w:t>
+      </w:r>
+      <w:r>
+        <w:t xml:space="preserve"> </w:t>
+      </w:r>
+      <w:r>
+        <w:t xml:space="preserve">에 위치시킨다. 더 많은 기술 클래스에 걸치는 특허가 전공정과 후공정 청구를 결합하는 특허이며, 좁은 특허는 한 단계에 특화한다. 이는 범위가 가치를 지닌다는 Lerner(1994)의 발견 및 파편화된 기술 시장에서의 넓은 포트폴리오에 관한 Ziedonis(2004)의 설명과 부합하지만, 융합적 해석을 더한다. 수율이 인접 단계의 역량에 달린 기술에서 범위의 넓음은 보호 전략일 뿐 아니라 청구항 속에서 융합이 취하는 형태다.</w:t>
+      </w:r>
+    </w:p>
+    <w:p>
+      <w:pPr>
+        <w:pStyle w:val="BodyText"/>
+      </w:pPr>
+      <w:r>
+        <w:rPr>
+          <w:i/>
+          <w:iCs/>
+        </w:rPr>
+        <w:t xml:space="preserve">축적이 아닌 재구성.</w:t>
+      </w:r>
+      <w:r>
+        <w:t xml:space="preserve"> </w:t>
+      </w:r>
+      <w:r>
+        <w:t xml:space="preserve">세 번째 함의는 동학에 관한 것이다. 융합을 단순하게 이해하면 경계를 넘는 특허의 비중이 시간에 따라 상승할 것으로 예측하게 된다. 그러나 결과는 그렇지 않았다. 통합형 청구는 비중을 유지하였고 순수 전공정 청구가 감소하였다. 이 패턴은</w:t>
+      </w:r>
+      <w:r>
+        <w:t xml:space="preserve"> </w:t>
+      </w:r>
+      <w:r>
+        <w:rPr>
+          <w:i/>
+          <w:iCs/>
+        </w:rPr>
+        <w:t xml:space="preserve">재구성(recomposition)</w:t>
+      </w:r>
+      <w:r>
+        <w:t xml:space="preserve"> </w:t>
+      </w:r>
+      <w:r>
+        <w:t xml:space="preserve">으로 더 잘 기술된다. 기술 생애의 초기에 중요했던 발명은 평탄화, 표면 활성화, 어닐링 등 제조 단계에 관한 것이었고 공정 발명으로 청구되었다. 기술이 성숙하여 W2W에서 D2W 응용으로 이동하면서 발명은 접합 구조와 통합 적층으로 옮겨갔고, 공정 지식은 특허</w:t>
+      </w:r>
+      <w:r>
+        <w:t xml:space="preserve"> </w:t>
+      </w:r>
+      <w:r>
+        <w:rPr>
+          <w:i/>
+          <w:iCs/>
+        </w:rPr>
+        <w:t xml:space="preserve">그 자체</w:t>
+      </w:r>
+      <w:r>
+        <w:t xml:space="preserve"> </w:t>
+      </w:r>
+      <w:r>
+        <w:t xml:space="preserve">에서 특허가</w:t>
+      </w:r>
+      <w:r>
+        <w:t xml:space="preserve"> </w:t>
+      </w:r>
+      <w:r>
+        <w:rPr>
+          <w:i/>
+          <w:iCs/>
+        </w:rPr>
+        <w:t xml:space="preserve">포함하는 것</w:t>
+      </w:r>
+      <w:r>
+        <w:t xml:space="preserve"> </w:t>
+      </w:r>
+      <w:r>
+        <w:t xml:space="preserve">이 되었다. 이는 Hacklin et al.(2009)의 공진화 논리를 단일 기술 안에서 관찰한 것이다. 융합은 더 많은 특허가 경계를 넘음으로써가 아니라 특허의 경계 넘는 내용이 형태를 바꿈으로써 진행된다. 이는 이항 모형의 음(−)의 연도 계수를 전공정으로부터의 후퇴로 읽어서는 안 되는 이유이기도 하다.</w:t>
+      </w:r>
+    </w:p>
+    <w:p>
+      <w:pPr>
+        <w:pStyle w:val="BodyText"/>
+      </w:pPr>
+      <w:r>
+        <w:rPr>
+          <w:i/>
+          <w:iCs/>
+        </w:rPr>
+        <w:t xml:space="preserve">산업 아키텍처와 추격이 청구에 남기는 흔적.</w:t>
+      </w:r>
+      <w:r>
+        <w:t xml:space="preserve"> </w:t>
+      </w:r>
+      <w:r>
+        <w:t xml:space="preserve">네 번째 함의는 특허 수준 결과를 전략 문헌과 연결한다. 관할권 대비는 공정 단독형 갈래에 집중되어 있으며 제2.4절에서 제시한 해석과 부합한다. 중국 출원청 출원은 범위가 좁고 공정 단독형에 편중되어 있다. 이는 통합된 적층 전체를 청구하기 전에 특정 제조 단계를 내재화하는 추격 자세의 프로필이며(Lee and Lim, 2001), 중국 특허의 양적 팽창이 보조금과 추격 동학에 의해 형성되어 왔다는 증거(Hu and Jefferson, 2009; Dang and Motohashi, 2015)와도 부합한다. 일본 출원청 출원은 넓고 사실상 공정 단독형이 없다. 이는 단일 단계 주변이 아니라 전체 공정 흐름에 걸쳐 특허를 내는 장비·소재 공급사의 강점(Langlois and Steinmueller, 1999) 및 1988년 개혁 이후의 다항 청구 관행(Sakakibara and Branstetter, 2001)과 부합한다. 한국과 대만은 범위와 통합형 갈래에서 미국 기준과 유사한데, 이는 미국 출원인과 정면으로 경쟁하는 메모리 제조사와 파운드리의 위치에 부합한다. 이들의 높은 공정 단독형 경향(대만은 10% 수준에서 유의)은 선도 파운드리가 첨단 패키징 플랫폼을 내재화하며 전공정 역량을 접합 공정에 투입해 온 산업계의 움직임(Lau, 2022; Yole Group, 2024)과 부합한다. 종합하면 이러한 패턴은 누가 어느 단계를 어디에서 점유하는가라는 산업</w:t>
+      </w:r>
+      <w:r>
+        <w:t xml:space="preserve"> </w:t>
+      </w:r>
+      <w:r>
+        <w:rPr>
+          <w:i/>
+          <w:iCs/>
+        </w:rPr>
+        <w:t xml:space="preserve">아키텍처</w:t>
+      </w:r>
+      <w:r>
+        <w:t xml:space="preserve"> </w:t>
+      </w:r>
+      <w:r>
+        <w:t xml:space="preserve">가</w:t>
+      </w:r>
+      <w:r>
+        <w:t xml:space="preserve"> </w:t>
+      </w:r>
+      <w:r>
+        <w:rPr>
+          <w:i/>
+          <w:iCs/>
+        </w:rPr>
+        <w:t xml:space="preserve">어떤</w:t>
+      </w:r>
+      <w:r>
+        <w:t xml:space="preserve"> </w:t>
+      </w:r>
+      <w:r>
+        <w:t xml:space="preserve">발명이 경계를 넘는지를 형성함을 보여주며, 이는 기업의 통합 선택이 산업 아키텍처를 형성한다는 Kapoor(2013)의 주장을 기업이 작성하는 청구항 수준으로 확장한 것이다.</w:t>
+      </w:r>
+    </w:p>
+    <w:bookmarkEnd w:id="39"/>
+    <w:bookmarkStart w:id="40" w:name="실무적정책적-함의"/>
+    <w:p>
+      <w:pPr>
+        <w:pStyle w:val="Heading3"/>
+      </w:pPr>
+      <w:r>
+        <w:t xml:space="preserve">6.2 실무적·정책적 함의</w:t>
+      </w:r>
+    </w:p>
+    <w:p>
+      <w:pPr>
+        <w:pStyle w:val="FirstParagraph"/>
+      </w:pPr>
+      <w:r>
+        <w:t xml:space="preserve">후공정 기업에게 본 연구의 결과는 분명한 경고를 담고 있다. 전통적 조립·테스트 모형은 제조와의 안정적 인터페이스에 의존했으나, 하이브리드 본딩에서 그 인터페이스는 해체되었고, 기술을 정의하는 특허는 전공정 공정에 닿는다. 평탄화와 표면 화학 역량이 없는 조립 전문기업은 가장 가치 있는 청구가 이미 파운드리와 장비 공급사에 의해 점유되어 있음을 발견할 것이다. 경계 넘기가 범위와 연관된다는 결과는 요구되는 역량이 단일 공정 단계가 아니라 웨이퍼 준비에서 접합된 적층까지의 흐름 전체를 청구할 수 있는 능력임을 시사한다.</w:t>
+      </w:r>
+    </w:p>
+    <w:p>
+      <w:pPr>
+        <w:pStyle w:val="BodyText"/>
+      </w:pPr>
+      <w:r>
+        <w:t xml:space="preserve">파운드리와 종합반도체기업에게 결과는 첨단 패키징의 내재화가 단순한 생산능력 결정이 아니라 Kapoor와 Adner(2012)의 의미에서 지식 경계 결정임을 확인해 준다. 지식 경계가 공정 단계를 넘어 확장된 기업만이 기술이 보상하는 통합형 청구를 작성할 수 있다. 장비·소재 공급사에게는 넓고 통합 지향적이며 공정 단독형이 없는 일본 출원청의 프로필이 전·후공정 인터페이스에서의 차별적이고 방어 가능한 위치를 시사한다.</w:t>
+      </w:r>
+    </w:p>
+    <w:p>
+      <w:pPr>
+        <w:pStyle w:val="BodyText"/>
+      </w:pPr>
+      <w:r>
+        <w:t xml:space="preserve">정책에 대해서는 관할권 대비가 시사적이다. 중국 출원청 프로필은 단계별로 진행되는 추격 전략을 보여준다. 이는 제조 역량의 내재화에는 효과적이지만 통합형 청구를 타국 출원인에게 남겨 둔다. 특허 건수를 보상하는 산업정책(Dang and Motohashi, 2015)은 이 패턴을 강화할 것이다. 메모리 제조사가 차세대 HBM을 위해 하이브리드 본딩에 의존하는 한국에 대해 결과는, 패키징 경쟁력이 패키징 노하우만이 아니라 평탄화, 표면 화학, 정렬 계측 등 전공정 역량과 이를 통합형 청구로 결합하는 능력에 의해 결정될 것임을 함의한다.</w:t>
+      </w:r>
+    </w:p>
     <w:bookmarkEnd w:id="40"/>
+    <w:bookmarkStart w:id="41" w:name="한계와-향후-연구"/>
+    <w:p>
+      <w:pPr>
+        <w:pStyle w:val="Heading3"/>
+      </w:pPr>
+      <w:r>
+        <w:t xml:space="preserve">6.3 한계와 향후 연구</w:t>
+      </w:r>
+    </w:p>
+    <w:p>
+      <w:pPr>
+        <w:pStyle w:val="FirstParagraph"/>
+      </w:pPr>
+      <w:r>
+        <w:t xml:space="preserve">본 연구는 네 가지 한계를 갖는다. 첫째, 관할권 변수는 출원청이지 출원인의 국적이 아니다. 출원청 간 차이는 발명의 기원과 보호 전략을 섞는다. 출원을 출원인 식별자와 본사 위치에 연결하면 둘을 분리하고 기업 고정효과를 넣을 수 있으며, 이는 본 연구의 모든 비교를 보다 정밀하게 할 것이다. 둘째, 추정치는 연관적이다. 범위와 전략은 공동 결정될 개연성이 있고, 데이터에 신뢰할 만한 도구변수가 없어 인과 식별을 시도하지 않는다. 셋째, 융합 신호는 CPC 공동분류로, 결정론적이고 재현 가능하지만 발명에 뒤처진다. 텍스트 기반 방법(Preschitschek et al., 2013; Zhu and Motohashi, 2022)은 심사관이 전공정 코드를 부여하기 전에 경계 넘기를 탐지할 수 있으나 학습된 모형에 의존한다는 비용이 따른다. H01L21과 H01L24의 경계가 제도적으로 명확한 본 연구의 설정에서는 재현가능성이 더 큰 미덕이라고 판단하였다. 경계가 덜 코드화된 설정에서는 이 상충관계가 반대로 작동할 수 있다. 넷째, 각 출원이 CPC 기호의 집합이라는 점에서 특허의 공동분류 구조는 다대다이며, 본 연구의 이항·삼분 부호화는 그 구조를 단일 경계로 투영한다. 고차 공출현을 보존하는 하이퍼그래프 표현과 Trajtenberg et al.(1997) 및 Petralia(2020) 전통의 일반성(generality) 지수는 하이브리드 본딩이 로직·메모리·이미지센서·전력소자로 확산되는 데서 시사되는 범용기술적 성격을 직접 검정할 수 있게 할 것이다(Bresnahan and Trajtenberg, 1995; Hall and Trajtenberg, 2004 참조).</w:t>
+      </w:r>
+    </w:p>
+    <w:p>
+      <w:pPr>
+        <w:pStyle w:val="BodyText"/>
+      </w:pPr>
+      <w:r>
+        <w:t xml:space="preserve">나아가 본 연구의 설계는 다른 맥락에서의 재현에 열려 있다. 디스플레이 제조의 첨단 리소그래피, 배터리의 셀-투-팩 통합, 항공우주 조립의 적층제조처럼 하류 단계가 상류 역량에 의존하기 시작하는 공정기술은 모두 동일한 두 클래스 공동분류 규칙과 이산선택 추정량으로 검토할 수 있다. 그러한 설정 간 비교 연구는 여기서 관찰된 재구성 동학이 일반적인지를 보여줄 것이다.</w:t>
+      </w:r>
+    </w:p>
     <w:bookmarkEnd w:id="41"/>
-    <w:bookmarkStart w:id="45" w:name="논의"/>
-    <w:p>
-      <w:pPr>
-        <w:pStyle w:val="Heading2"/>
-      </w:pPr>
-      <w:r>
-        <w:t xml:space="preserve">6. 논의</w:t>
-      </w:r>
-    </w:p>
-    <w:bookmarkStart w:id="42" w:name="이론적-함의"/>
-    <w:p>
-      <w:pPr>
-        <w:pStyle w:val="Heading3"/>
-      </w:pPr>
-      <w:r>
-        <w:t xml:space="preserve">6.1 이론적 함의</w:t>
-      </w:r>
-    </w:p>
-    <w:p>
-      <w:pPr>
-        <w:pStyle w:val="FirstParagraph"/>
-      </w:pPr>
-      <w:r>
-        <w:rPr>
-          <w:i/>
-          <w:iCs/>
-        </w:rPr>
-        <w:t xml:space="preserve">산업 내 융합.</w:t>
-      </w:r>
-      <w:r>
-        <w:t xml:space="preserve"> </w:t>
-      </w:r>
-      <w:r>
-        <w:t xml:space="preserve">첫 번째 함의는 융합 이론의 범위에 관한 것이다. 제2.1절에서 검토한 문헌은 융합을 산업</w:t>
-      </w:r>
-      <w:r>
-        <w:t xml:space="preserve"> </w:t>
-      </w:r>
-      <w:r>
-        <w:rPr>
-          <w:i/>
-          <w:iCs/>
-        </w:rPr>
-        <w:t xml:space="preserve">사이</w:t>
-      </w:r>
-      <w:r>
-        <w:t xml:space="preserve"> </w:t>
-      </w:r>
-      <w:r>
-        <w:t xml:space="preserve">에서 일어나는 것으로 다루며, 그 단계 모형은 한 산업의 지식이 다른 산업으로 이주하여 결국 산업 자체가 합쳐지는 과정을 기술한다(Hacklin et al., 2009; Curran and Leker, 2011). 본 연구의 결과는 같은 개념 장치가 반도체 제조의 제조 단계와 조립 단계 사이처럼 한 산업을</w:t>
-      </w:r>
-      <w:r>
-        <w:t xml:space="preserve"> </w:t>
-      </w:r>
-      <w:r>
-        <w:rPr>
-          <w:i/>
-          <w:iCs/>
-        </w:rPr>
-        <w:t xml:space="preserve">관통하는</w:t>
-      </w:r>
-      <w:r>
-        <w:t xml:space="preserve"> </w:t>
-      </w:r>
-      <w:r>
-        <w:t xml:space="preserve">경계에도 적용되며, 그 경계가 개별 발명 수준에서 관찰될 수 있음을 보인다. 하이브리드 본딩 특허의 거의 3분의 2가 전공정 기술을 청구하고, 최빈 특허는 통합형이다. Jacobides et al.(2006)의 견해대로 산업 아키텍처가 분업의 템플릿이라면, 이러한 산업 내 융합은 템플릿이 재협상되는 메커니즘이다. 단계 간 인터페이스가 안정성을 잃으면 발명이 그 양쪽을 모두 청구하기 시작하는 것이다.</w:t>
-      </w:r>
-    </w:p>
-    <w:p>
-      <w:pPr>
-        <w:pStyle w:val="BodyText"/>
-      </w:pPr>
-      <w:r>
-        <w:rPr>
-          <w:i/>
-          <w:iCs/>
-        </w:rPr>
-        <w:t xml:space="preserve">융합의 미시 메커니즘으로서의 범위.</w:t>
-      </w:r>
-      <w:r>
-        <w:t xml:space="preserve"> </w:t>
-      </w:r>
-      <w:r>
-        <w:t xml:space="preserve">두 번째 함의는 메커니즘에 관한 것이다. Kodama(1992)의 기술융합은 기업 R&amp;D 조직 수준에서 정식화되었고, 융합 지수는 분야 수준에서 정식화된다. 본 연구의 특허 수준 증거는 메커니즘을</w:t>
-      </w:r>
-      <w:r>
-        <w:t xml:space="preserve"> </w:t>
-      </w:r>
-      <w:r>
-        <w:rPr>
-          <w:i/>
-          <w:iCs/>
-        </w:rPr>
-        <w:t xml:space="preserve">개별 발명의 범위</w:t>
-      </w:r>
-      <w:r>
-        <w:t xml:space="preserve"> </w:t>
-      </w:r>
-      <w:r>
-        <w:t xml:space="preserve">에 위치시킨다. 더 많은 기술 클래스에 걸치는 특허가 전공정과 후공정 청구를 결합하는 특허이며, 좁은 특허는 한 단계에 특화한다. 이는 범위가 가치를 지닌다는 Lerner(1994)의 발견 및 파편화된 기술 시장에서의 넓은 포트폴리오에 관한 Ziedonis(2004)의 설명과 부합하지만, 융합적 해석을 더한다. 수율이 인접 단계의 역량에 달린 기술에서 범위의 넓음은 보호 전략일 뿐 아니라 청구항 속에서 융합이 취하는 형태다.</w:t>
-      </w:r>
-    </w:p>
-    <w:p>
-      <w:pPr>
-        <w:pStyle w:val="BodyText"/>
-      </w:pPr>
-      <w:r>
-        <w:rPr>
-          <w:i/>
-          <w:iCs/>
-        </w:rPr>
-        <w:t xml:space="preserve">축적이 아닌 재구성.</w:t>
-      </w:r>
-      <w:r>
-        <w:t xml:space="preserve"> </w:t>
-      </w:r>
-      <w:r>
-        <w:t xml:space="preserve">세 번째 함의는 동학에 관한 것이다. 융합을 단순하게 이해하면 경계를 넘는 특허의 비중이 시간에 따라 상승할 것으로 예측하게 된다. 그러나 결과는 그렇지 않았다. 통합형 청구는 비중을 유지하였고 순수 전공정 청구가 감소하였다. 이 패턴은</w:t>
-      </w:r>
-      <w:r>
-        <w:t xml:space="preserve"> </w:t>
-      </w:r>
-      <w:r>
-        <w:rPr>
-          <w:i/>
-          <w:iCs/>
-        </w:rPr>
-        <w:t xml:space="preserve">재구성(recomposition)</w:t>
-      </w:r>
-      <w:r>
-        <w:t xml:space="preserve"> </w:t>
-      </w:r>
-      <w:r>
-        <w:t xml:space="preserve">으로 더 잘 기술된다. 기술 생애의 초기에 중요했던 발명은 평탄화, 표면 활성화, 어닐링 등 제조 단계에 관한 것이었고 공정 발명으로 청구되었다. 기술이 성숙하여 W2W에서 D2W 응용으로 이동하면서 발명은 접합 구조와 통합 적층으로 옮겨갔고, 공정 지식은 특허</w:t>
-      </w:r>
-      <w:r>
-        <w:t xml:space="preserve"> </w:t>
-      </w:r>
-      <w:r>
-        <w:rPr>
-          <w:i/>
-          <w:iCs/>
-        </w:rPr>
-        <w:t xml:space="preserve">그 자체</w:t>
-      </w:r>
-      <w:r>
-        <w:t xml:space="preserve"> </w:t>
-      </w:r>
-      <w:r>
-        <w:t xml:space="preserve">에서 특허가</w:t>
-      </w:r>
-      <w:r>
-        <w:t xml:space="preserve"> </w:t>
-      </w:r>
-      <w:r>
-        <w:rPr>
-          <w:i/>
-          <w:iCs/>
-        </w:rPr>
-        <w:t xml:space="preserve">포함하는 것</w:t>
-      </w:r>
-      <w:r>
-        <w:t xml:space="preserve"> </w:t>
-      </w:r>
-      <w:r>
-        <w:t xml:space="preserve">이 되었다. 이는 Hacklin et al.(2009)의 공진화 논리를 단일 기술 안에서 관찰한 것이다. 융합은 더 많은 특허가 경계를 넘음으로써가 아니라 특허의 경계 넘는 내용이 형태를 바꿈으로써 진행된다. 이는 이항 모형의 음(−)의 연도 계수를 전공정으로부터의 후퇴로 읽어서는 안 되는 이유이기도 하다.</w:t>
-      </w:r>
-    </w:p>
-    <w:p>
-      <w:pPr>
-        <w:pStyle w:val="BodyText"/>
-      </w:pPr>
-      <w:r>
-        <w:rPr>
-          <w:i/>
-          <w:iCs/>
-        </w:rPr>
-        <w:t xml:space="preserve">산업 아키텍처와 추격이 청구에 남기는 흔적.</w:t>
-      </w:r>
-      <w:r>
-        <w:t xml:space="preserve"> </w:t>
-      </w:r>
-      <w:r>
-        <w:t xml:space="preserve">네 번째 함의는 특허 수준 결과를 전략 문헌과 연결한다. 관할권 대비는 공정 단독형 갈래에 집중되어 있으며 제2.4절에서 제시한 해석과 부합한다. 중국 출원청 출원은 범위가 좁고 공정 단독형에 편중되어 있다. 이는 통합된 적층 전체를 청구하기 전에 특정 제조 단계를 내재화하는 추격 자세의 프로필이며(Lee and Lim, 2001), 중국 특허의 양적 팽창이 보조금과 추격 동학에 의해 형성되어 왔다는 증거(Hu and Jefferson, 2009; Dang and Motohashi, 2015)와도 부합한다. 일본 출원청 출원은 넓고 사실상 공정 단독형이 없다. 이는 단일 단계 주변이 아니라 전체 공정 흐름에 걸쳐 특허를 내는 장비·소재 공급사의 강점(Langlois and Steinmueller, 1999) 및 1988년 개혁 이후의 다항 청구 관행(Sakakibara and Branstetter, 2001)과 부합한다. 한국과 대만은 범위와 통합형 갈래에서 미국 기준과 유사한데, 이는 미국 출원인과 정면으로 경쟁하는 메모리 제조사와 파운드리의 위치에 부합한다. 이들의 높은 공정 단독형 경향(대만은 10% 수준에서 유의)은 선도 파운드리가 첨단 패키징 플랫폼을 내재화하며 전공정 역량을 접합 공정에 투입해 온 산업계의 움직임(Lau, 2022; Yole Group, 2024)과 부합한다. 종합하면 이러한 패턴은 누가 어느 단계를 어디에서 점유하는가라는 산업</w:t>
-      </w:r>
-      <w:r>
-        <w:t xml:space="preserve"> </w:t>
-      </w:r>
-      <w:r>
-        <w:rPr>
-          <w:i/>
-          <w:iCs/>
-        </w:rPr>
-        <w:t xml:space="preserve">아키텍처</w:t>
-      </w:r>
-      <w:r>
-        <w:t xml:space="preserve"> </w:t>
-      </w:r>
-      <w:r>
-        <w:t xml:space="preserve">가</w:t>
-      </w:r>
-      <w:r>
-        <w:t xml:space="preserve"> </w:t>
-      </w:r>
-      <w:r>
-        <w:rPr>
-          <w:i/>
-          <w:iCs/>
-        </w:rPr>
-        <w:t xml:space="preserve">어떤</w:t>
-      </w:r>
-      <w:r>
-        <w:t xml:space="preserve"> </w:t>
-      </w:r>
-      <w:r>
-        <w:t xml:space="preserve">발명이 경계를 넘는지를 형성함을 보여주며, 이는 기업의 통합 선택이 산업 아키텍처를 형성한다는 Kapoor(2013)의 주장을 기업이 작성하는 청구항 수준으로 확장한 것이다.</w:t>
-      </w:r>
-    </w:p>
     <w:bookmarkEnd w:id="42"/>
-    <w:bookmarkStart w:id="43" w:name="실무적정책적-함의"/>
-    <w:p>
-      <w:pPr>
-        <w:pStyle w:val="Heading3"/>
-      </w:pPr>
-      <w:r>
-        <w:t xml:space="preserve">6.2 실무적·정책적 함의</w:t>
-      </w:r>
-    </w:p>
-    <w:p>
-      <w:pPr>
-        <w:pStyle w:val="FirstParagraph"/>
-      </w:pPr>
-      <w:r>
-        <w:t xml:space="preserve">후공정 기업에게 본 연구의 결과는 분명한 경고를 담고 있다. 전통적 조립·테스트 모형은 제조와의 안정적 인터페이스에 의존했으나, 하이브리드 본딩에서 그 인터페이스는 해체되었고, 기술을 정의하는 특허는 전공정 공정에 닿는다. 평탄화와 표면 화학 역량이 없는 조립 전문기업은 가장 가치 있는 청구가 이미 파운드리와 장비 공급사에 의해 점유되어 있음을 발견할 것이다. 경계 넘기가 범위와 연관된다는 결과는 요구되는 역량이 단일 공정 단계가 아니라 웨이퍼 준비에서 접합된 적층까지의 흐름 전체를 청구할 수 있는 능력임을 시사한다.</w:t>
-      </w:r>
-    </w:p>
-    <w:p>
-      <w:pPr>
-        <w:pStyle w:val="BodyText"/>
-      </w:pPr>
-      <w:r>
-        <w:t xml:space="preserve">파운드리와 종합반도체기업에게 결과는 첨단 패키징의 내재화가 단순한 생산능력 결정이 아니라 Kapoor와 Adner(2012)의 의미에서 지식 경계 결정임을 확인해 준다. 지식 경계가 공정 단계를 넘어 확장된 기업만이 기술이 보상하는 통합형 청구를 작성할 수 있다. 장비·소재 공급사에게는 넓고 통합 지향적이며 공정 단독형이 없는 일본 출원청의 프로필이 전·후공정 인터페이스에서의 차별적이고 방어 가능한 위치를 시사한다.</w:t>
-      </w:r>
-    </w:p>
-    <w:p>
-      <w:pPr>
-        <w:pStyle w:val="BodyText"/>
-      </w:pPr>
-      <w:r>
-        <w:t xml:space="preserve">정책에 대해서는 관할권 대비가 시사적이다. 중국 출원청 프로필은 단계별로 진행되는 추격 전략을 보여준다. 이는 제조 역량의 내재화에는 효과적이지만 통합형 청구를 타국 출원인에게 남겨 둔다. 특허 건수를 보상하는 산업정책(Dang and Motohashi, 2015)은 이 패턴을 강화할 것이다. 메모리 제조사가 차세대 HBM을 위해 하이브리드 본딩에 의존하는 한국에 대해 결과는, 패키징 경쟁력이 패키징 노하우만이 아니라 평탄화, 표면 화학, 정렬 계측 등 전공정 역량과 이를 통합형 청구로 결합하는 능력에 의해 결정될 것임을 함의한다.</w:t>
-      </w:r>
-    </w:p>
-    <w:bookmarkEnd w:id="43"/>
-    <w:bookmarkStart w:id="44" w:name="한계와-향후-연구"/>
-    <w:p>
-      <w:pPr>
-        <w:pStyle w:val="Heading3"/>
-      </w:pPr>
-      <w:r>
-        <w:t xml:space="preserve">6.3 한계와 향후 연구</w:t>
-      </w:r>
-    </w:p>
-    <w:p>
-      <w:pPr>
-        <w:pStyle w:val="FirstParagraph"/>
-      </w:pPr>
-      <w:r>
-        <w:t xml:space="preserve">본 연구는 네 가지 한계를 갖는다. 첫째, 관할권 변수는 출원청이지 출원인의 국적이 아니다. 출원청 간 차이는 발명의 기원과 보호 전략을 섞는다. 출원을 출원인 식별자와 본사 위치에 연결하면 둘을 분리하고 기업 고정효과를 넣을 수 있으며, 이는 본 연구의 모든 비교를 보다 정밀하게 할 것이다. 둘째, 추정치는 연관적이다. 범위와 전략은 공동 결정될 개연성이 있고, 데이터에 신뢰할 만한 도구변수가 없어 인과 식별을 시도하지 않는다. 셋째, 융합 신호는 CPC 공동분류로, 결정론적이고 재현 가능하지만 발명에 뒤처진다. 텍스트 기반 방법(Preschitschek et al., 2013; Zhu and Motohashi, 2022)은 심사관이 전공정 코드를 부여하기 전에 경계 넘기를 탐지할 수 있으나 학습된 모형에 의존한다는 비용이 따른다. H01L21과 H01L24의 경계가 제도적으로 명확한 본 연구의 설정에서는 재현가능성이 더 큰 미덕이라고 판단하였다. 경계가 덜 코드화된 설정에서는 이 상충관계가 반대로 작동할 수 있다. 넷째, 각 출원이 CPC 기호의 집합이라는 점에서 특허의 공동분류 구조는 다대다이며, 본 연구의 이항·삼분 부호화는 그 구조를 단일 경계로 투영한다. 고차 공출현을 보존하는 하이퍼그래프 표현과 Trajtenberg et al.(1997) 및 Petralia(2020) 전통의 일반성(generality) 지수는 하이브리드 본딩이 로직·메모리·이미지센서·전력소자로 확산되는 데서 시사되는 범용기술적 성격을 직접 검정할 수 있게 할 것이다(Bresnahan and Trajtenberg, 1995; Hall and Trajtenberg, 2004 참조).</w:t>
-      </w:r>
-    </w:p>
-    <w:p>
-      <w:pPr>
-        <w:pStyle w:val="BodyText"/>
-      </w:pPr>
-      <w:r>
-        <w:t xml:space="preserve">나아가 본 연구의 설계는 다른 맥락에서의 재현에 열려 있다. 디스플레이 제조의 첨단 리소그래피, 배터리의 셀-투-팩 통합, 항공우주 조립의 적층제조처럼 하류 단계가 상류 역량에 의존하기 시작하는 공정기술은 모두 동일한 두 클래스 공동분류 규칙과 이산선택 추정량으로 검토할 수 있다. 그러한 설정 간 비교 연구는 여기서 관찰된 재구성 동학이 일반적인지를 보여줄 것이다.</w:t>
-      </w:r>
-    </w:p>
-    <w:bookmarkEnd w:id="44"/>
-    <w:bookmarkEnd w:id="45"/>
-    <w:bookmarkStart w:id="46" w:name="결론"/>
+    <w:bookmarkStart w:id="43" w:name="결론"/>
     <w:p>
       <w:pPr>
         <w:pStyle w:val="Heading2"/>
@@ -4886,8 +4890,8 @@
         </w:pict>
       </w:r>
     </w:p>
-    <w:bookmarkEnd w:id="46"/>
-    <w:bookmarkStart w:id="47" w:name="참고문헌-references"/>
+    <w:bookmarkEnd w:id="43"/>
+    <w:bookmarkStart w:id="44" w:name="참고문헌-references"/>
     <w:p>
       <w:pPr>
         <w:pStyle w:val="Heading2"/>
@@ -5373,8 +5377,8 @@
         <w:t xml:space="preserve">Ziedonis, R.H., 2004. Don’t fence me in: Fragmented markets for technology and the patent acquisition strategies of firms. Management Science 50 (6), 804–820.</w:t>
       </w:r>
     </w:p>
-    <w:bookmarkEnd w:id="47"/>
-    <w:bookmarkEnd w:id="48"/>
+    <w:bookmarkEnd w:id="44"/>
+    <w:bookmarkEnd w:id="45"/>
     <w:sectPr>
       <w:footnotePr>
         <w:numRestart w:val="eachSect"/>

</xml_diff>

<commit_message>
journal v4_ko: fix cascaded figure renumbering (1–4)
Co-Authored-By: Claude Fable 5.1 <noreply@anthropic.com>
Claude-Session: https://claude.ai/code/session_01SvckvZxt3hAXTDPnm8YPEC
</commit_message>
<xml_diff>
--- a/journal/manuscript_v4_ko.docx
+++ b/journal/manuscript_v4_ko.docx
@@ -2879,7 +2879,7 @@
         <w:pStyle w:val="BodyText"/>
       </w:pPr>
       <w:r>
-        <w:t xml:space="preserve">세 가지 패턴이 확인된다. 첫째, 분야가 성숙하면서 범위가 넓어졌다. 연도 추세의 발생률비(IRR)는 1.014로, 서브클래스 수가 연간 약 1.4%씩 증가한다. 둘째, 미국 기준 대비 중국 출원청 출원은 약 21% 좁고(IRR 0.785, p &lt; 0.01) PCT 출원은 약 17% 좁은(IRR 0.826, p &lt; 0.01) 반면, 일본 출원청 출원은 표본에서 가장 넓다(IRR 1.270, p &lt; 0.10). 셋째, 한국(IRR 1.017), 대만(1.021), EPO(0.993)는 미국 기준과 구분되지 않는다. 그림 1은 모형이 함의하는 출원청별 예측 기술범위를 도시한다. 일본 출원청 출원이 더 넓다는 H3b의 범위 성분은 10% 수준에서 지지되며, 중국 출원청 출원의 좁음은 H3a에 대해 제시한 추격 해석과 부합한다.</w:t>
+        <w:t xml:space="preserve">세 가지 패턴이 확인된다. 첫째, 분야가 성숙하면서 범위가 넓어졌다. 연도 추세의 발생률비(IRR)는 1.014로, 서브클래스 수가 연간 약 1.4%씩 증가한다. 둘째, 미국 기준 대비 중국 출원청 출원은 약 21% 좁고(IRR 0.785, p &lt; 0.01) PCT 출원은 약 17% 좁은(IRR 0.826, p &lt; 0.01) 반면, 일본 출원청 출원은 표본에서 가장 넓다(IRR 1.270, p &lt; 0.10). 셋째, 한국(IRR 1.017), 대만(1.021), EPO(0.993)는 미국 기준과 구분되지 않는다. 그림 2는 모형이 함의하는 출원청별 예측 기술범위를 도시한다. 일본 출원청 출원이 더 넓다는 H3b의 범위 성분은 10% 수준에서 지지되며, 중국 출원청 출원의 좁음은 H3a에 대해 제시한 추격 해석과 부합한다.</w:t>
       </w:r>
     </w:p>
     <w:p>
@@ -2938,7 +2938,7 @@
           <w:b/>
           <w:bCs/>
         </w:rPr>
-        <w:t xml:space="preserve">그림 1.</w:t>
+        <w:t xml:space="preserve">그림 2.</w:t>
       </w:r>
       <w:r>
         <w:t xml:space="preserve"> </w:t>
@@ -2994,7 +2994,7 @@
         <w:t xml:space="preserve"> </w:t>
       </w:r>
       <w:r>
-        <w:t xml:space="preserve">이 감소한 것이다. 출원청 중에서는 중국 출원청만 미국 기준과 유의하게 다르며, 공정 청구의 승산이 65% 높다(OR 1.650, p &lt; 0.05). 이는 H3a를 지지한다. 일본 출원청의 승산비는 1 미만(0.483)이지만 26건에 기반하므로 추정이 부정확하다. 모형의 판별력은 수용 가능한 수준으로, ROC 곡선 하면적은 0.707이다(그림 1).</w:t>
+        <w:t xml:space="preserve">이 감소한 것이다. 출원청 중에서는 중국 출원청만 미국 기준과 유의하게 다르며, 공정 청구의 승산이 65% 높다(OR 1.650, p &lt; 0.05). 이는 H3a를 지지한다. 일본 출원청의 승산비는 1 미만(0.483)이지만 26건에 기반하므로 추정이 부정확하다. 모형의 판별력은 수용 가능한 수준으로, ROC 곡선 하면적은 0.707이다(그림 3).</w:t>
       </w:r>
     </w:p>
     <w:p>
@@ -3482,7 +3482,7 @@
           <w:b/>
           <w:bCs/>
         </w:rPr>
-        <w:t xml:space="preserve">그림 1.</w:t>
+        <w:t xml:space="preserve">그림 3.</w:t>
       </w:r>
       <w:r>
         <w:t xml:space="preserve"> </w:t>
@@ -4225,7 +4225,7 @@
         <w:pStyle w:val="BodyText"/>
       </w:pPr>
       <w:r>
-        <w:t xml:space="preserve">관할권 대비는 공정 단독형 갈래에 집중되어 있다. 중국 출원청은 미국 출원청보다 공정 단독형 특허의 상대위험이 훨씬 높고(RRR 2.687, p &lt; 0.01), 대만(RRR 2.102, p &lt; 0.10)과 PCT 경로(RRR 1.997, p &lt; 0.05)도 높은 반면, 일본 출원청은 거의 그렇지 않다(RRR 0.086, p &lt; 0.01). 통합형 갈래의 출원청 계수는 어느 것도 유의하지 않다. 범위와 시점을 통제하면 경계를 넘는 특허를 출원하는 성향은 출원청 간에 체계적으로 다르지 않다. 그림 1는 다른 공변량을 평균에 둔 채 출원청별 공정 단독형 전략의 예측 확률을 도시한다. 중국 출원청 출원은 약 4건 중 1건이 공정 단독형으로 예측되는 반면, 미국 출원청은 약 7건 중 1건, 일본 출원청은 약 50건 중 1건이다. H3a와 H3b의 전략 성분이 지지된다.</w:t>
+        <w:t xml:space="preserve">관할권 대비는 공정 단독형 갈래에 집중되어 있다. 중국 출원청은 미국 출원청보다 공정 단독형 특허의 상대위험이 훨씬 높고(RRR 2.687, p &lt; 0.01), 대만(RRR 2.102, p &lt; 0.10)과 PCT 경로(RRR 1.997, p &lt; 0.05)도 높은 반면, 일본 출원청은 거의 그렇지 않다(RRR 0.086, p &lt; 0.01). 통합형 갈래의 출원청 계수는 어느 것도 유의하지 않다. 범위와 시점을 통제하면 경계를 넘는 특허를 출원하는 성향은 출원청 간에 체계적으로 다르지 않다. 그림 4는 다른 공변량을 평균에 둔 채 출원청별 공정 단독형 전략의 예측 확률을 도시한다. 중국 출원청 출원은 약 4건 중 1건이 공정 단독형으로 예측되는 반면, 미국 출원청은 약 7건 중 1건, 일본 출원청은 약 50건 중 1건이다. H3a와 H3b의 전략 성분이 지지된다.</w:t>
       </w:r>
     </w:p>
     <w:p>
@@ -4284,7 +4284,7 @@
           <w:b/>
           <w:bCs/>
         </w:rPr>
-        <w:t xml:space="preserve">그림 1.</w:t>
+        <w:t xml:space="preserve">그림 4.</w:t>
       </w:r>
       <w:r>
         <w:t xml:space="preserve"> </w:t>

</xml_diff>